<commit_message>
nmv 17 05 2026
</commit_message>
<xml_diff>
--- a/TS Jatai Ghanam Project/TS 1.7/TS 1.7 Ghanam Malayalam Corrections.docx
+++ b/TS Jatai Ghanam Project/TS 1.7/TS 1.7 Ghanam Malayalam Corrections.docx
@@ -191,6 +191,2028 @@
               <w:autoSpaceDE w:val="0"/>
               <w:autoSpaceDN w:val="0"/>
               <w:adjustRightInd w:val="0"/>
+              <w:spacing w:before="0" w:line="240" w:lineRule="auto"/>
+              <w:rPr>
+                <w:rFonts w:ascii="BRH Malayalam Extra" w:hAnsi="BRH Malayalam Extra" w:cs="BRH Malayalam Extra"/>
+                <w:color w:val="000000"/>
+                <w:sz w:val="32"/>
+                <w:szCs w:val="44"/>
+              </w:rPr>
+            </w:pPr>
+            <w:r>
+              <w:rPr>
+                <w:rFonts w:cs="BRH Malayalam Extra"/>
+                <w:color w:val="000000"/>
+                <w:szCs w:val="44"/>
+              </w:rPr>
+              <w:t>21</w:t>
+            </w:r>
+            <w:r>
+              <w:rPr>
+                <w:rFonts w:ascii="BRH Malayalam Extra" w:hAnsi="BRH Malayalam Extra" w:cs="BRH Malayalam Extra"/>
+                <w:color w:val="000000"/>
+                <w:sz w:val="32"/>
+                <w:szCs w:val="44"/>
+              </w:rPr>
+              <w:t>)</w:t>
+            </w:r>
+            <w:r>
+              <w:rPr>
+                <w:rFonts w:ascii="BRH Malayalam Extra" w:hAnsi="BRH Malayalam Extra" w:cs="BRH Malayalam Extra"/>
+                <w:color w:val="000000"/>
+                <w:sz w:val="32"/>
+                <w:szCs w:val="44"/>
+              </w:rPr>
+              <w:tab/>
+            </w:r>
+            <w:r>
+              <w:rPr>
+                <w:rFonts w:cs="BRH Malayalam Extra"/>
+                <w:color w:val="000000"/>
+                <w:szCs w:val="44"/>
+              </w:rPr>
+              <w:t>1</w:t>
+            </w:r>
+            <w:r>
+              <w:rPr>
+                <w:rFonts w:ascii="BRH Malayalam Extra" w:hAnsi="BRH Malayalam Extra" w:cs="BRH Malayalam Extra"/>
+                <w:color w:val="000000"/>
+                <w:sz w:val="32"/>
+                <w:szCs w:val="44"/>
+              </w:rPr>
+              <w:t>.</w:t>
+            </w:r>
+            <w:r>
+              <w:rPr>
+                <w:rFonts w:cs="BRH Malayalam Extra"/>
+                <w:color w:val="000000"/>
+                <w:szCs w:val="44"/>
+              </w:rPr>
+              <w:t>7</w:t>
+            </w:r>
+            <w:r>
+              <w:rPr>
+                <w:rFonts w:ascii="BRH Malayalam Extra" w:hAnsi="BRH Malayalam Extra" w:cs="BRH Malayalam Extra"/>
+                <w:color w:val="000000"/>
+                <w:sz w:val="32"/>
+                <w:szCs w:val="44"/>
+              </w:rPr>
+              <w:t>.</w:t>
+            </w:r>
+            <w:r>
+              <w:rPr>
+                <w:rFonts w:cs="BRH Malayalam Extra"/>
+                <w:color w:val="000000"/>
+                <w:szCs w:val="44"/>
+              </w:rPr>
+              <w:t>2</w:t>
+            </w:r>
+            <w:r>
+              <w:rPr>
+                <w:rFonts w:ascii="BRH Malayalam Extra" w:hAnsi="BRH Malayalam Extra" w:cs="BRH Malayalam Extra"/>
+                <w:color w:val="000000"/>
+                <w:sz w:val="32"/>
+                <w:szCs w:val="44"/>
+              </w:rPr>
+              <w:t>.</w:t>
+            </w:r>
+            <w:r>
+              <w:rPr>
+                <w:rFonts w:cs="BRH Malayalam Extra"/>
+                <w:color w:val="000000"/>
+                <w:szCs w:val="44"/>
+              </w:rPr>
+              <w:t>2</w:t>
+            </w:r>
+            <w:r>
+              <w:rPr>
+                <w:rFonts w:ascii="BRH Malayalam Extra" w:hAnsi="BRH Malayalam Extra" w:cs="BRH Malayalam Extra"/>
+                <w:color w:val="000000"/>
+                <w:sz w:val="32"/>
+                <w:szCs w:val="44"/>
+              </w:rPr>
+              <w:t>(</w:t>
+            </w:r>
+            <w:r>
+              <w:rPr>
+                <w:rFonts w:cs="BRH Malayalam Extra"/>
+                <w:color w:val="000000"/>
+                <w:szCs w:val="44"/>
+              </w:rPr>
+              <w:t>20</w:t>
+            </w:r>
+            <w:r>
+              <w:rPr>
+                <w:rFonts w:ascii="BRH Malayalam Extra" w:hAnsi="BRH Malayalam Extra" w:cs="BRH Malayalam Extra"/>
+                <w:color w:val="000000"/>
+                <w:sz w:val="32"/>
+                <w:szCs w:val="44"/>
+              </w:rPr>
+              <w:t>)</w:t>
+            </w:r>
+            <w:proofErr w:type="gramStart"/>
+            <w:r>
+              <w:rPr>
+                <w:rFonts w:ascii="BRH Malayalam Extra" w:hAnsi="BRH Malayalam Extra" w:cs="BRH Malayalam Extra"/>
+                <w:color w:val="000000"/>
+                <w:sz w:val="32"/>
+                <w:szCs w:val="44"/>
+              </w:rPr>
+              <w:t>-  põx</w:t>
+            </w:r>
+            <w:proofErr w:type="gramEnd"/>
+            <w:r>
+              <w:rPr>
+                <w:rFonts w:ascii="BRH Malayalam Extra" w:hAnsi="BRH Malayalam Extra" w:cs="BRH Malayalam Extra"/>
+                <w:color w:val="000000"/>
+                <w:sz w:val="26"/>
+                <w:szCs w:val="44"/>
+              </w:rPr>
+              <w:t>–</w:t>
+            </w:r>
+            <w:r>
+              <w:rPr>
+                <w:rFonts w:ascii="BRH Malayalam Extra" w:hAnsi="BRH Malayalam Extra" w:cs="BRH Malayalam Extra"/>
+                <w:color w:val="000000"/>
+                <w:sz w:val="32"/>
+                <w:szCs w:val="44"/>
+              </w:rPr>
+              <w:t>¥dd— | i</w:t>
+            </w:r>
+            <w:r>
+              <w:rPr>
+                <w:rFonts w:ascii="BRH Malayalam Extra" w:hAnsi="BRH Malayalam Extra" w:cs="BRH Malayalam Extra"/>
+                <w:color w:val="000000"/>
+                <w:sz w:val="26"/>
+                <w:szCs w:val="44"/>
+              </w:rPr>
+              <w:t>–</w:t>
+            </w:r>
+            <w:r>
+              <w:rPr>
+                <w:rFonts w:ascii="BRH Malayalam Extra" w:hAnsi="BRH Malayalam Extra" w:cs="BRH Malayalam Extra"/>
+                <w:color w:val="000000"/>
+                <w:sz w:val="32"/>
+                <w:szCs w:val="44"/>
+              </w:rPr>
+              <w:t>d¡</w:t>
+            </w:r>
+            <w:r>
+              <w:rPr>
+                <w:rFonts w:ascii="BRH Malayalam Extra" w:hAnsi="BRH Malayalam Extra" w:cs="BRH Malayalam Extra"/>
+                <w:color w:val="000000"/>
+                <w:sz w:val="26"/>
+                <w:szCs w:val="44"/>
+              </w:rPr>
+              <w:t>–</w:t>
+            </w:r>
+            <w:r>
+              <w:rPr>
+                <w:rFonts w:ascii="BRH Malayalam Extra" w:hAnsi="BRH Malayalam Extra" w:cs="BRH Malayalam Extra"/>
+                <w:color w:val="000000"/>
+                <w:sz w:val="32"/>
+                <w:szCs w:val="44"/>
+              </w:rPr>
+              <w:t>rõx©— | jxI |</w:t>
+            </w:r>
+          </w:p>
+          <w:p>
+            <w:pPr>
+              <w:widowControl w:val="0"/>
+              <w:autoSpaceDE w:val="0"/>
+              <w:autoSpaceDN w:val="0"/>
+              <w:adjustRightInd w:val="0"/>
+              <w:spacing w:before="0" w:line="240" w:lineRule="auto"/>
+              <w:rPr>
+                <w:rFonts w:ascii="BRH Malayalam Extra" w:hAnsi="BRH Malayalam Extra" w:cs="BRH Malayalam Extra"/>
+                <w:color w:val="000000"/>
+                <w:sz w:val="32"/>
+                <w:szCs w:val="44"/>
+              </w:rPr>
+            </w:pPr>
+            <w:r>
+              <w:rPr>
+                <w:rFonts w:ascii="BRH Malayalam Extra" w:hAnsi="BRH Malayalam Extra" w:cs="BRH Malayalam Extra"/>
+                <w:color w:val="000000"/>
+                <w:sz w:val="32"/>
+                <w:szCs w:val="44"/>
+              </w:rPr>
+              <w:t>põx</w:t>
+            </w:r>
+            <w:r>
+              <w:rPr>
+                <w:rFonts w:ascii="BRH Malayalam Extra" w:hAnsi="BRH Malayalam Extra" w:cs="BRH Malayalam Extra"/>
+                <w:color w:val="000000"/>
+                <w:sz w:val="26"/>
+                <w:szCs w:val="44"/>
+              </w:rPr>
+              <w:t>–</w:t>
+            </w:r>
+            <w:r>
+              <w:rPr>
+                <w:rFonts w:ascii="BRH Malayalam Extra" w:hAnsi="BRH Malayalam Extra" w:cs="BRH Malayalam Extra"/>
+                <w:color w:val="000000"/>
+                <w:sz w:val="32"/>
+                <w:szCs w:val="44"/>
+              </w:rPr>
+              <w:t>¥dd— id¡</w:t>
+            </w:r>
+            <w:r>
+              <w:rPr>
+                <w:rFonts w:ascii="BRH Malayalam Extra" w:hAnsi="BRH Malayalam Extra" w:cs="BRH Malayalam Extra"/>
+                <w:color w:val="000000"/>
+                <w:sz w:val="26"/>
+                <w:szCs w:val="44"/>
+              </w:rPr>
+              <w:t>–</w:t>
+            </w:r>
+            <w:r>
+              <w:rPr>
+                <w:rFonts w:ascii="BRH Malayalam Extra" w:hAnsi="BRH Malayalam Extra" w:cs="BRH Malayalam Extra"/>
+                <w:color w:val="000000"/>
+                <w:sz w:val="32"/>
+                <w:szCs w:val="44"/>
+              </w:rPr>
+              <w:t>rõx˜© id¡</w:t>
+            </w:r>
+            <w:r>
+              <w:rPr>
+                <w:rFonts w:ascii="BRH Malayalam Extra" w:hAnsi="BRH Malayalam Extra" w:cs="BRH Malayalam Extra"/>
+                <w:color w:val="000000"/>
+                <w:sz w:val="26"/>
+                <w:szCs w:val="44"/>
+              </w:rPr>
+              <w:t>–</w:t>
+            </w:r>
+            <w:r>
+              <w:rPr>
+                <w:rFonts w:ascii="BRH Malayalam Extra" w:hAnsi="BRH Malayalam Extra" w:cs="BRH Malayalam Extra"/>
+                <w:color w:val="000000"/>
+                <w:sz w:val="32"/>
+                <w:szCs w:val="44"/>
+              </w:rPr>
+              <w:t>rõx˜© põx</w:t>
+            </w:r>
+            <w:r>
+              <w:rPr>
+                <w:rFonts w:ascii="BRH Malayalam Extra" w:hAnsi="BRH Malayalam Extra" w:cs="BRH Malayalam Extra"/>
+                <w:color w:val="000000"/>
+                <w:sz w:val="26"/>
+                <w:szCs w:val="44"/>
+              </w:rPr>
+              <w:t>–</w:t>
+            </w:r>
+            <w:r>
+              <w:rPr>
+                <w:rFonts w:ascii="BRH Malayalam Extra" w:hAnsi="BRH Malayalam Extra" w:cs="BRH Malayalam Extra"/>
+                <w:color w:val="000000"/>
+                <w:sz w:val="32"/>
+                <w:szCs w:val="44"/>
+              </w:rPr>
+              <w:t>¥dd— põx</w:t>
+            </w:r>
+            <w:r>
+              <w:rPr>
+                <w:rFonts w:ascii="BRH Malayalam Extra" w:hAnsi="BRH Malayalam Extra" w:cs="BRH Malayalam Extra"/>
+                <w:color w:val="000000"/>
+                <w:sz w:val="26"/>
+                <w:szCs w:val="44"/>
+              </w:rPr>
+              <w:t>–</w:t>
+            </w:r>
+            <w:r>
+              <w:rPr>
+                <w:rFonts w:ascii="BRH Malayalam Extra" w:hAnsi="BRH Malayalam Extra" w:cs="BRH Malayalam Extra"/>
+                <w:color w:val="000000"/>
+                <w:sz w:val="32"/>
+                <w:szCs w:val="44"/>
+              </w:rPr>
+              <w:t>¥dd— id¡</w:t>
+            </w:r>
+            <w:r>
+              <w:rPr>
+                <w:rFonts w:ascii="BRH Malayalam Extra" w:hAnsi="BRH Malayalam Extra" w:cs="BRH Malayalam Extra"/>
+                <w:color w:val="000000"/>
+                <w:sz w:val="26"/>
+                <w:szCs w:val="44"/>
+              </w:rPr>
+              <w:t>–</w:t>
+            </w:r>
+            <w:r>
+              <w:rPr>
+                <w:rFonts w:ascii="BRH Malayalam Extra" w:hAnsi="BRH Malayalam Extra" w:cs="BRH Malayalam Extra"/>
+                <w:color w:val="000000"/>
+                <w:sz w:val="32"/>
+                <w:szCs w:val="44"/>
+                <w:highlight w:val="yellow"/>
+              </w:rPr>
+              <w:t>rõx</w:t>
+            </w:r>
+            <w:r>
+              <w:rPr>
+                <w:rFonts w:ascii="BRH Malayalam Extra" w:hAnsi="BRH Malayalam Extra" w:cs="BRH Malayalam Extra"/>
+                <w:color w:val="000000"/>
+                <w:sz w:val="26"/>
+                <w:szCs w:val="44"/>
+                <w:highlight w:val="yellow"/>
+              </w:rPr>
+              <w:t>–</w:t>
+            </w:r>
+            <w:r>
+              <w:rPr>
+                <w:rFonts w:ascii="BRH Malayalam Extra" w:hAnsi="BRH Malayalam Extra" w:cs="BRH Malayalam Extra"/>
+                <w:color w:val="000000"/>
+                <w:sz w:val="32"/>
+                <w:szCs w:val="44"/>
+                <w:highlight w:val="yellow"/>
+              </w:rPr>
+              <w:t>©</w:t>
+            </w:r>
+            <w:r>
+              <w:rPr>
+                <w:rFonts w:ascii="BRH Malayalam Extra" w:hAnsi="BRH Malayalam Extra" w:cs="BRH Malayalam Extra"/>
+                <w:color w:val="000000"/>
+                <w:sz w:val="26"/>
+                <w:szCs w:val="44"/>
+                <w:highlight w:val="yellow"/>
+              </w:rPr>
+              <w:t>–</w:t>
+            </w:r>
+            <w:r>
+              <w:rPr>
+                <w:rFonts w:ascii="BRH Malayalam Extra" w:hAnsi="BRH Malayalam Extra" w:cs="BRH Malayalam Extra"/>
+                <w:color w:val="000000"/>
+                <w:sz w:val="32"/>
+                <w:szCs w:val="44"/>
+                <w:highlight w:val="yellow"/>
+              </w:rPr>
+              <w:t>.</w:t>
+            </w:r>
+            <w:r>
+              <w:rPr>
+                <w:rFonts w:ascii="BRH Malayalam Extra" w:hAnsi="BRH Malayalam Extra" w:cs="BRH Malayalam Extra"/>
+                <w:color w:val="000000"/>
+                <w:sz w:val="32"/>
+                <w:szCs w:val="44"/>
+              </w:rPr>
+              <w:t xml:space="preserve"> jxI </w:t>
+            </w:r>
+            <w:r>
+              <w:rPr>
+                <w:rFonts w:ascii="BRH Devanagari Extra" w:hAnsi="BRH Devanagari Extra" w:cs="BRH Malayalam Extra"/>
+                <w:color w:val="000000"/>
+                <w:szCs w:val="44"/>
+              </w:rPr>
+              <w:t>Æ</w:t>
+            </w:r>
+            <w:r>
+              <w:rPr>
+                <w:rFonts w:ascii="BRH Malayalam Extra" w:hAnsi="BRH Malayalam Extra" w:cs="BRH Malayalam Extra"/>
+                <w:color w:val="000000"/>
+                <w:sz w:val="32"/>
+                <w:szCs w:val="44"/>
+              </w:rPr>
+              <w:t>jxI i—d¡</w:t>
+            </w:r>
+            <w:r>
+              <w:rPr>
+                <w:rFonts w:ascii="BRH Malayalam Extra" w:hAnsi="BRH Malayalam Extra" w:cs="BRH Malayalam Extra"/>
+                <w:color w:val="000000"/>
+                <w:sz w:val="26"/>
+                <w:szCs w:val="44"/>
+              </w:rPr>
+              <w:t>–</w:t>
+            </w:r>
+            <w:r>
+              <w:rPr>
+                <w:rFonts w:ascii="BRH Malayalam Extra" w:hAnsi="BRH Malayalam Extra" w:cs="BRH Malayalam Extra"/>
+                <w:color w:val="000000"/>
+                <w:sz w:val="32"/>
+                <w:szCs w:val="44"/>
+              </w:rPr>
+              <w:t>rõx˜© põx</w:t>
+            </w:r>
+            <w:r>
+              <w:rPr>
+                <w:rFonts w:ascii="BRH Malayalam Extra" w:hAnsi="BRH Malayalam Extra" w:cs="BRH Malayalam Extra"/>
+                <w:color w:val="000000"/>
+                <w:sz w:val="26"/>
+                <w:szCs w:val="44"/>
+              </w:rPr>
+              <w:t>–</w:t>
+            </w:r>
+            <w:r>
+              <w:rPr>
+                <w:rFonts w:ascii="BRH Malayalam Extra" w:hAnsi="BRH Malayalam Extra" w:cs="BRH Malayalam Extra"/>
+                <w:color w:val="000000"/>
+                <w:sz w:val="32"/>
+                <w:szCs w:val="44"/>
+              </w:rPr>
+              <w:t>¥dd— põx</w:t>
+            </w:r>
+            <w:r>
+              <w:rPr>
+                <w:rFonts w:ascii="BRH Malayalam Extra" w:hAnsi="BRH Malayalam Extra" w:cs="BRH Malayalam Extra"/>
+                <w:color w:val="000000"/>
+                <w:sz w:val="26"/>
+                <w:szCs w:val="44"/>
+              </w:rPr>
+              <w:t>–</w:t>
+            </w:r>
+            <w:r>
+              <w:rPr>
+                <w:rFonts w:ascii="BRH Malayalam Extra" w:hAnsi="BRH Malayalam Extra" w:cs="BRH Malayalam Extra"/>
+                <w:color w:val="000000"/>
+                <w:sz w:val="32"/>
+                <w:szCs w:val="44"/>
+              </w:rPr>
+              <w:t>¥dd— id¡</w:t>
+            </w:r>
+            <w:r>
+              <w:rPr>
+                <w:rFonts w:ascii="BRH Malayalam Extra" w:hAnsi="BRH Malayalam Extra" w:cs="BRH Malayalam Extra"/>
+                <w:color w:val="000000"/>
+                <w:sz w:val="26"/>
+                <w:szCs w:val="44"/>
+              </w:rPr>
+              <w:t>–</w:t>
+            </w:r>
+            <w:r>
+              <w:rPr>
+                <w:rFonts w:ascii="BRH Malayalam Extra" w:hAnsi="BRH Malayalam Extra" w:cs="BRH Malayalam Extra"/>
+                <w:color w:val="000000"/>
+                <w:sz w:val="32"/>
+                <w:szCs w:val="44"/>
+                <w:highlight w:val="yellow"/>
+              </w:rPr>
+              <w:t>rõx</w:t>
+            </w:r>
+            <w:r>
+              <w:rPr>
+                <w:rFonts w:ascii="BRH Malayalam Extra" w:hAnsi="BRH Malayalam Extra" w:cs="BRH Malayalam Extra"/>
+                <w:color w:val="000000"/>
+                <w:sz w:val="26"/>
+                <w:szCs w:val="44"/>
+                <w:highlight w:val="yellow"/>
+              </w:rPr>
+              <w:t>–</w:t>
+            </w:r>
+            <w:r>
+              <w:rPr>
+                <w:rFonts w:ascii="BRH Malayalam Extra" w:hAnsi="BRH Malayalam Extra" w:cs="BRH Malayalam Extra"/>
+                <w:color w:val="000000"/>
+                <w:sz w:val="32"/>
+                <w:szCs w:val="44"/>
+                <w:highlight w:val="yellow"/>
+              </w:rPr>
+              <w:t>©</w:t>
+            </w:r>
+            <w:r>
+              <w:rPr>
+                <w:rFonts w:ascii="BRH Malayalam Extra" w:hAnsi="BRH Malayalam Extra" w:cs="BRH Malayalam Extra"/>
+                <w:color w:val="000000"/>
+                <w:sz w:val="26"/>
+                <w:szCs w:val="44"/>
+                <w:highlight w:val="yellow"/>
+              </w:rPr>
+              <w:t>–</w:t>
+            </w:r>
+            <w:r>
+              <w:rPr>
+                <w:rFonts w:ascii="BRH Malayalam Extra" w:hAnsi="BRH Malayalam Extra" w:cs="BRH Malayalam Extra"/>
+                <w:color w:val="000000"/>
+                <w:sz w:val="32"/>
+                <w:szCs w:val="44"/>
+                <w:highlight w:val="yellow"/>
+              </w:rPr>
+              <w:t>.</w:t>
+            </w:r>
+            <w:r>
+              <w:rPr>
+                <w:rFonts w:ascii="BRH Malayalam Extra" w:hAnsi="BRH Malayalam Extra" w:cs="BRH Malayalam Extra"/>
+                <w:color w:val="000000"/>
+                <w:sz w:val="32"/>
+                <w:szCs w:val="44"/>
+              </w:rPr>
+              <w:t xml:space="preserve"> jxI | </w:t>
+            </w:r>
+          </w:p>
+          <w:p>
+            <w:pPr>
+              <w:widowControl w:val="0"/>
+              <w:autoSpaceDE w:val="0"/>
+              <w:autoSpaceDN w:val="0"/>
+              <w:adjustRightInd w:val="0"/>
+              <w:spacing w:before="0" w:line="240" w:lineRule="auto"/>
+              <w:rPr>
+                <w:rFonts w:ascii="BRH Malayalam Extra" w:hAnsi="BRH Malayalam Extra" w:cs="BRH Malayalam Extra"/>
+                <w:color w:val="000000"/>
+                <w:sz w:val="32"/>
+                <w:szCs w:val="44"/>
+              </w:rPr>
+            </w:pPr>
+            <w:r>
+              <w:rPr>
+                <w:rFonts w:cs="BRH Malayalam Extra"/>
+                <w:color w:val="000000"/>
+                <w:szCs w:val="44"/>
+              </w:rPr>
+              <w:t>23</w:t>
+            </w:r>
+            <w:r>
+              <w:rPr>
+                <w:rFonts w:ascii="BRH Malayalam Extra" w:hAnsi="BRH Malayalam Extra" w:cs="BRH Malayalam Extra"/>
+                <w:color w:val="000000"/>
+                <w:sz w:val="32"/>
+                <w:szCs w:val="44"/>
+              </w:rPr>
+              <w:t>)</w:t>
+            </w:r>
+            <w:r>
+              <w:rPr>
+                <w:rFonts w:ascii="BRH Malayalam Extra" w:hAnsi="BRH Malayalam Extra" w:cs="BRH Malayalam Extra"/>
+                <w:color w:val="000000"/>
+                <w:sz w:val="32"/>
+                <w:szCs w:val="44"/>
+              </w:rPr>
+              <w:tab/>
+            </w:r>
+            <w:r>
+              <w:rPr>
+                <w:rFonts w:cs="BRH Malayalam Extra"/>
+                <w:color w:val="000000"/>
+                <w:szCs w:val="44"/>
+              </w:rPr>
+              <w:t>1</w:t>
+            </w:r>
+            <w:r>
+              <w:rPr>
+                <w:rFonts w:ascii="BRH Malayalam Extra" w:hAnsi="BRH Malayalam Extra" w:cs="BRH Malayalam Extra"/>
+                <w:color w:val="000000"/>
+                <w:sz w:val="32"/>
+                <w:szCs w:val="44"/>
+              </w:rPr>
+              <w:t>.</w:t>
+            </w:r>
+            <w:r>
+              <w:rPr>
+                <w:rFonts w:cs="BRH Malayalam Extra"/>
+                <w:color w:val="000000"/>
+                <w:szCs w:val="44"/>
+              </w:rPr>
+              <w:t>7</w:t>
+            </w:r>
+            <w:r>
+              <w:rPr>
+                <w:rFonts w:ascii="BRH Malayalam Extra" w:hAnsi="BRH Malayalam Extra" w:cs="BRH Malayalam Extra"/>
+                <w:color w:val="000000"/>
+                <w:sz w:val="32"/>
+                <w:szCs w:val="44"/>
+              </w:rPr>
+              <w:t>.</w:t>
+            </w:r>
+            <w:r>
+              <w:rPr>
+                <w:rFonts w:cs="BRH Malayalam Extra"/>
+                <w:color w:val="000000"/>
+                <w:szCs w:val="44"/>
+              </w:rPr>
+              <w:t>2</w:t>
+            </w:r>
+            <w:r>
+              <w:rPr>
+                <w:rFonts w:ascii="BRH Malayalam Extra" w:hAnsi="BRH Malayalam Extra" w:cs="BRH Malayalam Extra"/>
+                <w:color w:val="000000"/>
+                <w:sz w:val="32"/>
+                <w:szCs w:val="44"/>
+              </w:rPr>
+              <w:t>.</w:t>
+            </w:r>
+            <w:r>
+              <w:rPr>
+                <w:rFonts w:cs="BRH Malayalam Extra"/>
+                <w:color w:val="000000"/>
+                <w:szCs w:val="44"/>
+              </w:rPr>
+              <w:t>2</w:t>
+            </w:r>
+            <w:r>
+              <w:rPr>
+                <w:rFonts w:ascii="BRH Malayalam Extra" w:hAnsi="BRH Malayalam Extra" w:cs="BRH Malayalam Extra"/>
+                <w:color w:val="000000"/>
+                <w:sz w:val="32"/>
+                <w:szCs w:val="44"/>
+              </w:rPr>
+              <w:t>(</w:t>
+            </w:r>
+            <w:r>
+              <w:rPr>
+                <w:rFonts w:cs="BRH Malayalam Extra"/>
+                <w:color w:val="000000"/>
+                <w:szCs w:val="44"/>
+              </w:rPr>
+              <w:t>21</w:t>
+            </w:r>
+            <w:r>
+              <w:rPr>
+                <w:rFonts w:ascii="BRH Malayalam Extra" w:hAnsi="BRH Malayalam Extra" w:cs="BRH Malayalam Extra"/>
+                <w:color w:val="000000"/>
+                <w:sz w:val="32"/>
+                <w:szCs w:val="44"/>
+              </w:rPr>
+              <w:t>)</w:t>
+            </w:r>
+            <w:proofErr w:type="gramStart"/>
+            <w:r>
+              <w:rPr>
+                <w:rFonts w:ascii="BRH Malayalam Extra" w:hAnsi="BRH Malayalam Extra" w:cs="BRH Malayalam Extra"/>
+                <w:color w:val="000000"/>
+                <w:sz w:val="32"/>
+                <w:szCs w:val="44"/>
+              </w:rPr>
+              <w:t>-  i</w:t>
+            </w:r>
+            <w:proofErr w:type="gramEnd"/>
+            <w:r>
+              <w:rPr>
+                <w:rFonts w:ascii="BRH Malayalam Extra" w:hAnsi="BRH Malayalam Extra" w:cs="BRH Malayalam Extra"/>
+                <w:color w:val="000000"/>
+                <w:sz w:val="26"/>
+                <w:szCs w:val="44"/>
+              </w:rPr>
+              <w:t>–</w:t>
+            </w:r>
+            <w:r>
+              <w:rPr>
+                <w:rFonts w:ascii="BRH Malayalam Extra" w:hAnsi="BRH Malayalam Extra" w:cs="BRH Malayalam Extra"/>
+                <w:color w:val="000000"/>
+                <w:sz w:val="32"/>
+                <w:szCs w:val="44"/>
+              </w:rPr>
+              <w:t>d¡</w:t>
+            </w:r>
+            <w:r>
+              <w:rPr>
+                <w:rFonts w:ascii="BRH Malayalam Extra" w:hAnsi="BRH Malayalam Extra" w:cs="BRH Malayalam Extra"/>
+                <w:color w:val="000000"/>
+                <w:sz w:val="26"/>
+                <w:szCs w:val="44"/>
+              </w:rPr>
+              <w:t>–</w:t>
+            </w:r>
+            <w:r>
+              <w:rPr>
+                <w:rFonts w:ascii="BRH Malayalam Extra" w:hAnsi="BRH Malayalam Extra" w:cs="BRH Malayalam Extra"/>
+                <w:color w:val="000000"/>
+                <w:sz w:val="32"/>
+                <w:szCs w:val="44"/>
+              </w:rPr>
+              <w:t>rõx©— | jxI | ey</w:t>
+            </w:r>
+            <w:r>
+              <w:rPr>
+                <w:rFonts w:ascii="BRH Malayalam Extra" w:hAnsi="BRH Malayalam Extra" w:cs="BRH Malayalam Extra"/>
+                <w:color w:val="000000"/>
+                <w:sz w:val="26"/>
+                <w:szCs w:val="44"/>
+              </w:rPr>
+              <w:t>–</w:t>
+            </w:r>
+            <w:r>
+              <w:rPr>
+                <w:rFonts w:ascii="BRH Malayalam Extra" w:hAnsi="BRH Malayalam Extra" w:cs="BRH Malayalam Extra"/>
+                <w:color w:val="000000"/>
+                <w:sz w:val="32"/>
+                <w:szCs w:val="44"/>
+              </w:rPr>
+              <w:t>Z£hõ—J |</w:t>
+            </w:r>
+          </w:p>
+          <w:p>
+            <w:pPr>
+              <w:widowControl w:val="0"/>
+              <w:autoSpaceDE w:val="0"/>
+              <w:autoSpaceDN w:val="0"/>
+              <w:adjustRightInd w:val="0"/>
+              <w:spacing w:before="0" w:line="240" w:lineRule="auto"/>
+              <w:rPr>
+                <w:rFonts w:ascii="BRH Malayalam Extra" w:hAnsi="BRH Malayalam Extra" w:cs="BRH Malayalam Extra"/>
+                <w:color w:val="000000"/>
+                <w:sz w:val="32"/>
+                <w:szCs w:val="44"/>
+              </w:rPr>
+            </w:pPr>
+            <w:r>
+              <w:rPr>
+                <w:rFonts w:ascii="BRH Malayalam Extra" w:hAnsi="BRH Malayalam Extra" w:cs="BRH Malayalam Extra"/>
+                <w:color w:val="000000"/>
+                <w:sz w:val="32"/>
+                <w:szCs w:val="44"/>
+              </w:rPr>
+              <w:t>i</w:t>
+            </w:r>
+            <w:r>
+              <w:rPr>
+                <w:rFonts w:ascii="BRH Malayalam Extra" w:hAnsi="BRH Malayalam Extra" w:cs="BRH Malayalam Extra"/>
+                <w:color w:val="000000"/>
+                <w:sz w:val="26"/>
+                <w:szCs w:val="44"/>
+              </w:rPr>
+              <w:t>–</w:t>
+            </w:r>
+            <w:r>
+              <w:rPr>
+                <w:rFonts w:ascii="BRH Malayalam Extra" w:hAnsi="BRH Malayalam Extra" w:cs="BRH Malayalam Extra"/>
+                <w:color w:val="000000"/>
+                <w:sz w:val="32"/>
+                <w:szCs w:val="44"/>
+              </w:rPr>
+              <w:t>d¡</w:t>
+            </w:r>
+            <w:r>
+              <w:rPr>
+                <w:rFonts w:ascii="BRH Malayalam Extra" w:hAnsi="BRH Malayalam Extra" w:cs="BRH Malayalam Extra"/>
+                <w:color w:val="000000"/>
+                <w:sz w:val="26"/>
+                <w:szCs w:val="44"/>
+              </w:rPr>
+              <w:t>–</w:t>
+            </w:r>
+            <w:r>
+              <w:rPr>
+                <w:rFonts w:ascii="BRH Malayalam Extra" w:hAnsi="BRH Malayalam Extra" w:cs="BRH Malayalam Extra"/>
+                <w:color w:val="000000"/>
+                <w:sz w:val="32"/>
+                <w:szCs w:val="44"/>
+                <w:highlight w:val="yellow"/>
+              </w:rPr>
+              <w:t>rõx</w:t>
+            </w:r>
+            <w:r>
+              <w:rPr>
+                <w:rFonts w:ascii="BRH Malayalam Extra" w:hAnsi="BRH Malayalam Extra" w:cs="BRH Malayalam Extra"/>
+                <w:color w:val="000000"/>
+                <w:sz w:val="26"/>
+                <w:szCs w:val="44"/>
+                <w:highlight w:val="yellow"/>
+              </w:rPr>
+              <w:t>–</w:t>
+            </w:r>
+            <w:r>
+              <w:rPr>
+                <w:rFonts w:ascii="BRH Malayalam Extra" w:hAnsi="BRH Malayalam Extra" w:cs="BRH Malayalam Extra"/>
+                <w:color w:val="000000"/>
+                <w:sz w:val="32"/>
+                <w:szCs w:val="44"/>
+                <w:highlight w:val="yellow"/>
+              </w:rPr>
+              <w:t>©</w:t>
+            </w:r>
+            <w:r>
+              <w:rPr>
+                <w:rFonts w:ascii="BRH Malayalam Extra" w:hAnsi="BRH Malayalam Extra" w:cs="BRH Malayalam Extra"/>
+                <w:color w:val="000000"/>
+                <w:sz w:val="26"/>
+                <w:szCs w:val="44"/>
+                <w:highlight w:val="yellow"/>
+              </w:rPr>
+              <w:t>–</w:t>
+            </w:r>
+            <w:r>
+              <w:rPr>
+                <w:rFonts w:ascii="BRH Malayalam Extra" w:hAnsi="BRH Malayalam Extra" w:cs="BRH Malayalam Extra"/>
+                <w:color w:val="000000"/>
+                <w:sz w:val="32"/>
+                <w:szCs w:val="44"/>
+                <w:highlight w:val="yellow"/>
+              </w:rPr>
+              <w:t>.</w:t>
+            </w:r>
+            <w:r>
+              <w:rPr>
+                <w:rFonts w:ascii="BRH Malayalam Extra" w:hAnsi="BRH Malayalam Extra" w:cs="BRH Malayalam Extra"/>
+                <w:color w:val="000000"/>
+                <w:sz w:val="32"/>
+                <w:szCs w:val="44"/>
+              </w:rPr>
+              <w:t xml:space="preserve"> jxI </w:t>
+            </w:r>
+            <w:r>
+              <w:rPr>
+                <w:rFonts w:ascii="BRH Devanagari Extra" w:hAnsi="BRH Devanagari Extra" w:cs="BRH Malayalam Extra"/>
+                <w:color w:val="000000"/>
+                <w:szCs w:val="44"/>
+              </w:rPr>
+              <w:t>Æ</w:t>
+            </w:r>
+            <w:r>
+              <w:rPr>
+                <w:rFonts w:ascii="BRH Malayalam Extra" w:hAnsi="BRH Malayalam Extra" w:cs="BRH Malayalam Extra"/>
+                <w:color w:val="000000"/>
+                <w:sz w:val="32"/>
+                <w:szCs w:val="44"/>
+              </w:rPr>
+              <w:t>jxI i—d¡</w:t>
+            </w:r>
+            <w:r>
+              <w:rPr>
+                <w:rFonts w:ascii="BRH Malayalam Extra" w:hAnsi="BRH Malayalam Extra" w:cs="BRH Malayalam Extra"/>
+                <w:color w:val="000000"/>
+                <w:sz w:val="26"/>
+                <w:szCs w:val="44"/>
+              </w:rPr>
+              <w:t>–</w:t>
+            </w:r>
+            <w:r>
+              <w:rPr>
+                <w:rFonts w:ascii="BRH Malayalam Extra" w:hAnsi="BRH Malayalam Extra" w:cs="BRH Malayalam Extra"/>
+                <w:color w:val="000000"/>
+                <w:sz w:val="32"/>
+                <w:szCs w:val="44"/>
+              </w:rPr>
+              <w:t>rõx˜© id¡</w:t>
+            </w:r>
+            <w:r>
+              <w:rPr>
+                <w:rFonts w:ascii="BRH Malayalam Extra" w:hAnsi="BRH Malayalam Extra" w:cs="BRH Malayalam Extra"/>
+                <w:color w:val="000000"/>
+                <w:sz w:val="26"/>
+                <w:szCs w:val="44"/>
+              </w:rPr>
+              <w:t>–</w:t>
+            </w:r>
+            <w:r>
+              <w:rPr>
+                <w:rFonts w:ascii="BRH Malayalam Extra" w:hAnsi="BRH Malayalam Extra" w:cs="BRH Malayalam Extra"/>
+                <w:color w:val="000000"/>
+                <w:sz w:val="32"/>
+                <w:szCs w:val="44"/>
+                <w:highlight w:val="yellow"/>
+              </w:rPr>
+              <w:t>rõx</w:t>
+            </w:r>
+            <w:r>
+              <w:rPr>
+                <w:rFonts w:ascii="BRH Malayalam Extra" w:hAnsi="BRH Malayalam Extra" w:cs="BRH Malayalam Extra"/>
+                <w:color w:val="000000"/>
+                <w:sz w:val="26"/>
+                <w:szCs w:val="44"/>
+                <w:highlight w:val="yellow"/>
+              </w:rPr>
+              <w:t>–</w:t>
+            </w:r>
+            <w:r>
+              <w:rPr>
+                <w:rFonts w:ascii="BRH Malayalam Extra" w:hAnsi="BRH Malayalam Extra" w:cs="BRH Malayalam Extra"/>
+                <w:color w:val="000000"/>
+                <w:sz w:val="32"/>
+                <w:szCs w:val="44"/>
+                <w:highlight w:val="yellow"/>
+              </w:rPr>
+              <w:t>©</w:t>
+            </w:r>
+            <w:r>
+              <w:rPr>
+                <w:rFonts w:ascii="BRH Malayalam Extra" w:hAnsi="BRH Malayalam Extra" w:cs="BRH Malayalam Extra"/>
+                <w:color w:val="000000"/>
+                <w:sz w:val="26"/>
+                <w:szCs w:val="44"/>
+                <w:highlight w:val="yellow"/>
+              </w:rPr>
+              <w:t>–</w:t>
+            </w:r>
+            <w:r>
+              <w:rPr>
+                <w:rFonts w:ascii="BRH Malayalam Extra" w:hAnsi="BRH Malayalam Extra" w:cs="BRH Malayalam Extra"/>
+                <w:color w:val="000000"/>
+                <w:sz w:val="32"/>
+                <w:szCs w:val="44"/>
+                <w:highlight w:val="yellow"/>
+              </w:rPr>
+              <w:t>.</w:t>
+            </w:r>
+            <w:r>
+              <w:rPr>
+                <w:rFonts w:ascii="BRH Malayalam Extra" w:hAnsi="BRH Malayalam Extra" w:cs="BRH Malayalam Extra"/>
+                <w:color w:val="000000"/>
+                <w:sz w:val="32"/>
+                <w:szCs w:val="44"/>
+              </w:rPr>
+              <w:t xml:space="preserve"> jxI </w:t>
+            </w:r>
+          </w:p>
+          <w:p>
+            <w:pPr>
+              <w:widowControl w:val="0"/>
+              <w:autoSpaceDE w:val="0"/>
+              <w:autoSpaceDN w:val="0"/>
+              <w:adjustRightInd w:val="0"/>
+              <w:spacing w:before="0" w:line="240" w:lineRule="auto"/>
+              <w:rPr>
+                <w:rFonts w:ascii="BRH Malayalam Extra" w:hAnsi="BRH Malayalam Extra" w:cs="BRH Malayalam Extra"/>
+                <w:color w:val="000000"/>
+                <w:sz w:val="32"/>
+                <w:szCs w:val="44"/>
+              </w:rPr>
+            </w:pPr>
+            <w:r>
+              <w:rPr>
+                <w:rFonts w:ascii="BRH Malayalam Extra" w:hAnsi="BRH Malayalam Extra" w:cs="BRH Malayalam Extra"/>
+                <w:color w:val="000000"/>
+                <w:sz w:val="32"/>
+                <w:szCs w:val="44"/>
+              </w:rPr>
+              <w:t>ey</w:t>
+            </w:r>
+            <w:r>
+              <w:rPr>
+                <w:rFonts w:ascii="BRH Malayalam Extra" w:hAnsi="BRH Malayalam Extra" w:cs="BRH Malayalam Extra"/>
+                <w:color w:val="000000"/>
+                <w:sz w:val="26"/>
+                <w:szCs w:val="44"/>
+              </w:rPr>
+              <w:t>–</w:t>
+            </w:r>
+            <w:r>
+              <w:rPr>
+                <w:rFonts w:ascii="BRH Malayalam Extra" w:hAnsi="BRH Malayalam Extra" w:cs="BRH Malayalam Extra"/>
+                <w:color w:val="000000"/>
+                <w:sz w:val="32"/>
+                <w:szCs w:val="44"/>
+              </w:rPr>
+              <w:t>Z£hõ—J ey</w:t>
+            </w:r>
+            <w:r>
+              <w:rPr>
+                <w:rFonts w:ascii="BRH Malayalam Extra" w:hAnsi="BRH Malayalam Extra" w:cs="BRH Malayalam Extra"/>
+                <w:color w:val="000000"/>
+                <w:sz w:val="26"/>
+                <w:szCs w:val="44"/>
+              </w:rPr>
+              <w:t>–</w:t>
+            </w:r>
+            <w:r>
+              <w:rPr>
+                <w:rFonts w:ascii="BRH Malayalam Extra" w:hAnsi="BRH Malayalam Extra" w:cs="BRH Malayalam Extra"/>
+                <w:color w:val="000000"/>
+                <w:sz w:val="32"/>
+                <w:szCs w:val="44"/>
+              </w:rPr>
+              <w:t>Z£¥hõx</w:t>
+            </w:r>
+            <w:r>
+              <w:rPr>
+                <w:rFonts w:ascii="BRH Malayalam Extra" w:hAnsi="BRH Malayalam Extra" w:cs="BRH Malayalam Extra"/>
+                <w:color w:val="000000"/>
+                <w:sz w:val="26"/>
+                <w:szCs w:val="44"/>
+              </w:rPr>
+              <w:t>–</w:t>
+            </w:r>
+            <w:r>
+              <w:rPr>
+                <w:rFonts w:ascii="BRH Malayalam Extra" w:hAnsi="BRH Malayalam Extra" w:cs="BRH Malayalam Extra"/>
+                <w:color w:val="000000"/>
+                <w:sz w:val="32"/>
+                <w:szCs w:val="44"/>
+              </w:rPr>
+              <w:t xml:space="preserve"> jxI i—d¡</w:t>
+            </w:r>
+            <w:r>
+              <w:rPr>
+                <w:rFonts w:ascii="BRH Malayalam Extra" w:hAnsi="BRH Malayalam Extra" w:cs="BRH Malayalam Extra"/>
+                <w:color w:val="000000"/>
+                <w:sz w:val="26"/>
+                <w:szCs w:val="44"/>
+              </w:rPr>
+              <w:t>–</w:t>
+            </w:r>
+            <w:r>
+              <w:rPr>
+                <w:rFonts w:ascii="BRH Malayalam Extra" w:hAnsi="BRH Malayalam Extra" w:cs="BRH Malayalam Extra"/>
+                <w:color w:val="000000"/>
+                <w:sz w:val="32"/>
+                <w:szCs w:val="44"/>
+              </w:rPr>
+              <w:t>rõx˜© id¡</w:t>
+            </w:r>
+            <w:r>
+              <w:rPr>
+                <w:rFonts w:ascii="BRH Malayalam Extra" w:hAnsi="BRH Malayalam Extra" w:cs="BRH Malayalam Extra"/>
+                <w:color w:val="000000"/>
+                <w:sz w:val="26"/>
+                <w:szCs w:val="44"/>
+              </w:rPr>
+              <w:t>–</w:t>
+            </w:r>
+            <w:r>
+              <w:rPr>
+                <w:rFonts w:ascii="BRH Malayalam Extra" w:hAnsi="BRH Malayalam Extra" w:cs="BRH Malayalam Extra"/>
+                <w:color w:val="000000"/>
+                <w:sz w:val="32"/>
+                <w:szCs w:val="44"/>
+                <w:highlight w:val="yellow"/>
+              </w:rPr>
+              <w:t>rõx</w:t>
+            </w:r>
+            <w:r>
+              <w:rPr>
+                <w:rFonts w:ascii="BRH Malayalam Extra" w:hAnsi="BRH Malayalam Extra" w:cs="BRH Malayalam Extra"/>
+                <w:color w:val="000000"/>
+                <w:sz w:val="26"/>
+                <w:szCs w:val="44"/>
+                <w:highlight w:val="yellow"/>
+              </w:rPr>
+              <w:t>–</w:t>
+            </w:r>
+            <w:r>
+              <w:rPr>
+                <w:rFonts w:ascii="BRH Malayalam Extra" w:hAnsi="BRH Malayalam Extra" w:cs="BRH Malayalam Extra"/>
+                <w:color w:val="000000"/>
+                <w:sz w:val="32"/>
+                <w:szCs w:val="44"/>
+                <w:highlight w:val="yellow"/>
+              </w:rPr>
+              <w:t>©</w:t>
+            </w:r>
+            <w:r>
+              <w:rPr>
+                <w:rFonts w:ascii="BRH Malayalam Extra" w:hAnsi="BRH Malayalam Extra" w:cs="BRH Malayalam Extra"/>
+                <w:color w:val="000000"/>
+                <w:sz w:val="26"/>
+                <w:szCs w:val="44"/>
+              </w:rPr>
+              <w:t>–</w:t>
+            </w:r>
+            <w:r>
+              <w:rPr>
+                <w:rFonts w:ascii="BRH Malayalam Extra" w:hAnsi="BRH Malayalam Extra" w:cs="BRH Malayalam Extra"/>
+                <w:color w:val="000000"/>
+                <w:sz w:val="32"/>
+                <w:szCs w:val="44"/>
+              </w:rPr>
+              <w:t>. jxI ey</w:t>
+            </w:r>
+            <w:r>
+              <w:rPr>
+                <w:rFonts w:ascii="BRH Malayalam Extra" w:hAnsi="BRH Malayalam Extra" w:cs="BRH Malayalam Extra"/>
+                <w:color w:val="000000"/>
+                <w:sz w:val="26"/>
+                <w:szCs w:val="44"/>
+              </w:rPr>
+              <w:t>–</w:t>
+            </w:r>
+            <w:r>
+              <w:rPr>
+                <w:rFonts w:ascii="BRH Malayalam Extra" w:hAnsi="BRH Malayalam Extra" w:cs="BRH Malayalam Extra"/>
+                <w:color w:val="000000"/>
+                <w:sz w:val="32"/>
+                <w:szCs w:val="44"/>
+              </w:rPr>
+              <w:t xml:space="preserve">Z£hõ—J | </w:t>
+            </w:r>
+          </w:p>
+          <w:p>
+            <w:pPr>
+              <w:widowControl w:val="0"/>
+              <w:autoSpaceDE w:val="0"/>
+              <w:autoSpaceDN w:val="0"/>
+              <w:adjustRightInd w:val="0"/>
+              <w:spacing w:before="0" w:line="240" w:lineRule="auto"/>
+              <w:rPr>
+                <w:rFonts w:cs="BRH Malayalam Extra"/>
+                <w:color w:val="000000"/>
+                <w:szCs w:val="44"/>
+              </w:rPr>
+            </w:pPr>
+          </w:p>
+        </w:tc>
+        <w:tc>
+          <w:tcPr>
+            <w:tcW w:w="7371" w:type="dxa"/>
+          </w:tcPr>
+          <w:p>
+            <w:pPr>
+              <w:widowControl w:val="0"/>
+              <w:autoSpaceDE w:val="0"/>
+              <w:autoSpaceDN w:val="0"/>
+              <w:adjustRightInd w:val="0"/>
+              <w:spacing w:before="0" w:line="240" w:lineRule="auto"/>
+              <w:rPr>
+                <w:rFonts w:ascii="BRH Malayalam Extra" w:hAnsi="BRH Malayalam Extra" w:cs="BRH Malayalam Extra"/>
+                <w:color w:val="000000"/>
+                <w:sz w:val="32"/>
+                <w:szCs w:val="44"/>
+              </w:rPr>
+            </w:pPr>
+            <w:r>
+              <w:rPr>
+                <w:rFonts w:cs="BRH Malayalam Extra"/>
+                <w:color w:val="000000"/>
+                <w:szCs w:val="44"/>
+              </w:rPr>
+              <w:t>21</w:t>
+            </w:r>
+            <w:r>
+              <w:rPr>
+                <w:rFonts w:ascii="BRH Malayalam Extra" w:hAnsi="BRH Malayalam Extra" w:cs="BRH Malayalam Extra"/>
+                <w:color w:val="000000"/>
+                <w:sz w:val="32"/>
+                <w:szCs w:val="44"/>
+              </w:rPr>
+              <w:t>)</w:t>
+            </w:r>
+            <w:r>
+              <w:rPr>
+                <w:rFonts w:ascii="BRH Malayalam Extra" w:hAnsi="BRH Malayalam Extra" w:cs="BRH Malayalam Extra"/>
+                <w:color w:val="000000"/>
+                <w:sz w:val="32"/>
+                <w:szCs w:val="44"/>
+              </w:rPr>
+              <w:tab/>
+            </w:r>
+            <w:r>
+              <w:rPr>
+                <w:rFonts w:cs="BRH Malayalam Extra"/>
+                <w:color w:val="000000"/>
+                <w:szCs w:val="44"/>
+              </w:rPr>
+              <w:t>1</w:t>
+            </w:r>
+            <w:r>
+              <w:rPr>
+                <w:rFonts w:ascii="BRH Malayalam Extra" w:hAnsi="BRH Malayalam Extra" w:cs="BRH Malayalam Extra"/>
+                <w:color w:val="000000"/>
+                <w:sz w:val="32"/>
+                <w:szCs w:val="44"/>
+              </w:rPr>
+              <w:t>.</w:t>
+            </w:r>
+            <w:r>
+              <w:rPr>
+                <w:rFonts w:cs="BRH Malayalam Extra"/>
+                <w:color w:val="000000"/>
+                <w:szCs w:val="44"/>
+              </w:rPr>
+              <w:t>7</w:t>
+            </w:r>
+            <w:r>
+              <w:rPr>
+                <w:rFonts w:ascii="BRH Malayalam Extra" w:hAnsi="BRH Malayalam Extra" w:cs="BRH Malayalam Extra"/>
+                <w:color w:val="000000"/>
+                <w:sz w:val="32"/>
+                <w:szCs w:val="44"/>
+              </w:rPr>
+              <w:t>.</w:t>
+            </w:r>
+            <w:r>
+              <w:rPr>
+                <w:rFonts w:cs="BRH Malayalam Extra"/>
+                <w:color w:val="000000"/>
+                <w:szCs w:val="44"/>
+              </w:rPr>
+              <w:t>2</w:t>
+            </w:r>
+            <w:r>
+              <w:rPr>
+                <w:rFonts w:ascii="BRH Malayalam Extra" w:hAnsi="BRH Malayalam Extra" w:cs="BRH Malayalam Extra"/>
+                <w:color w:val="000000"/>
+                <w:sz w:val="32"/>
+                <w:szCs w:val="44"/>
+              </w:rPr>
+              <w:t>.</w:t>
+            </w:r>
+            <w:r>
+              <w:rPr>
+                <w:rFonts w:cs="BRH Malayalam Extra"/>
+                <w:color w:val="000000"/>
+                <w:szCs w:val="44"/>
+              </w:rPr>
+              <w:t>2</w:t>
+            </w:r>
+            <w:r>
+              <w:rPr>
+                <w:rFonts w:ascii="BRH Malayalam Extra" w:hAnsi="BRH Malayalam Extra" w:cs="BRH Malayalam Extra"/>
+                <w:color w:val="000000"/>
+                <w:sz w:val="32"/>
+                <w:szCs w:val="44"/>
+              </w:rPr>
+              <w:t>(</w:t>
+            </w:r>
+            <w:r>
+              <w:rPr>
+                <w:rFonts w:cs="BRH Malayalam Extra"/>
+                <w:color w:val="000000"/>
+                <w:szCs w:val="44"/>
+              </w:rPr>
+              <w:t>20</w:t>
+            </w:r>
+            <w:r>
+              <w:rPr>
+                <w:rFonts w:ascii="BRH Malayalam Extra" w:hAnsi="BRH Malayalam Extra" w:cs="BRH Malayalam Extra"/>
+                <w:color w:val="000000"/>
+                <w:sz w:val="32"/>
+                <w:szCs w:val="44"/>
+              </w:rPr>
+              <w:t>)</w:t>
+            </w:r>
+            <w:proofErr w:type="gramStart"/>
+            <w:r>
+              <w:rPr>
+                <w:rFonts w:ascii="BRH Malayalam Extra" w:hAnsi="BRH Malayalam Extra" w:cs="BRH Malayalam Extra"/>
+                <w:color w:val="000000"/>
+                <w:sz w:val="32"/>
+                <w:szCs w:val="44"/>
+              </w:rPr>
+              <w:t>-  põx</w:t>
+            </w:r>
+            <w:proofErr w:type="gramEnd"/>
+            <w:r>
+              <w:rPr>
+                <w:rFonts w:ascii="BRH Malayalam Extra" w:hAnsi="BRH Malayalam Extra" w:cs="BRH Malayalam Extra"/>
+                <w:color w:val="000000"/>
+                <w:sz w:val="26"/>
+                <w:szCs w:val="44"/>
+              </w:rPr>
+              <w:t>–</w:t>
+            </w:r>
+            <w:r>
+              <w:rPr>
+                <w:rFonts w:ascii="BRH Malayalam Extra" w:hAnsi="BRH Malayalam Extra" w:cs="BRH Malayalam Extra"/>
+                <w:color w:val="000000"/>
+                <w:sz w:val="32"/>
+                <w:szCs w:val="44"/>
+              </w:rPr>
+              <w:t>¥dd— | i</w:t>
+            </w:r>
+            <w:r>
+              <w:rPr>
+                <w:rFonts w:ascii="BRH Malayalam Extra" w:hAnsi="BRH Malayalam Extra" w:cs="BRH Malayalam Extra"/>
+                <w:color w:val="000000"/>
+                <w:sz w:val="26"/>
+                <w:szCs w:val="44"/>
+              </w:rPr>
+              <w:t>–</w:t>
+            </w:r>
+            <w:r>
+              <w:rPr>
+                <w:rFonts w:ascii="BRH Malayalam Extra" w:hAnsi="BRH Malayalam Extra" w:cs="BRH Malayalam Extra"/>
+                <w:color w:val="000000"/>
+                <w:sz w:val="32"/>
+                <w:szCs w:val="44"/>
+              </w:rPr>
+              <w:t>d¡</w:t>
+            </w:r>
+            <w:r>
+              <w:rPr>
+                <w:rFonts w:ascii="BRH Malayalam Extra" w:hAnsi="BRH Malayalam Extra" w:cs="BRH Malayalam Extra"/>
+                <w:color w:val="000000"/>
+                <w:sz w:val="26"/>
+                <w:szCs w:val="44"/>
+              </w:rPr>
+              <w:t>–</w:t>
+            </w:r>
+            <w:r>
+              <w:rPr>
+                <w:rFonts w:ascii="BRH Malayalam Extra" w:hAnsi="BRH Malayalam Extra" w:cs="BRH Malayalam Extra"/>
+                <w:color w:val="000000"/>
+                <w:sz w:val="32"/>
+                <w:szCs w:val="44"/>
+              </w:rPr>
+              <w:t>rõx©— | jxI |</w:t>
+            </w:r>
+          </w:p>
+          <w:p>
+            <w:pPr>
+              <w:widowControl w:val="0"/>
+              <w:autoSpaceDE w:val="0"/>
+              <w:autoSpaceDN w:val="0"/>
+              <w:adjustRightInd w:val="0"/>
+              <w:spacing w:before="0" w:line="240" w:lineRule="auto"/>
+              <w:rPr>
+                <w:rFonts w:ascii="BRH Malayalam Extra" w:hAnsi="BRH Malayalam Extra" w:cs="BRH Malayalam Extra"/>
+                <w:color w:val="000000"/>
+                <w:sz w:val="32"/>
+                <w:szCs w:val="44"/>
+              </w:rPr>
+            </w:pPr>
+            <w:r>
+              <w:rPr>
+                <w:rFonts w:ascii="BRH Malayalam Extra" w:hAnsi="BRH Malayalam Extra" w:cs="BRH Malayalam Extra"/>
+                <w:color w:val="000000"/>
+                <w:sz w:val="32"/>
+                <w:szCs w:val="44"/>
+              </w:rPr>
+              <w:t>põx</w:t>
+            </w:r>
+            <w:r>
+              <w:rPr>
+                <w:rFonts w:ascii="BRH Malayalam Extra" w:hAnsi="BRH Malayalam Extra" w:cs="BRH Malayalam Extra"/>
+                <w:color w:val="000000"/>
+                <w:sz w:val="26"/>
+                <w:szCs w:val="44"/>
+              </w:rPr>
+              <w:t>–</w:t>
+            </w:r>
+            <w:r>
+              <w:rPr>
+                <w:rFonts w:ascii="BRH Malayalam Extra" w:hAnsi="BRH Malayalam Extra" w:cs="BRH Malayalam Extra"/>
+                <w:color w:val="000000"/>
+                <w:sz w:val="32"/>
+                <w:szCs w:val="44"/>
+              </w:rPr>
+              <w:t>¥dd— id¡</w:t>
+            </w:r>
+            <w:r>
+              <w:rPr>
+                <w:rFonts w:ascii="BRH Malayalam Extra" w:hAnsi="BRH Malayalam Extra" w:cs="BRH Malayalam Extra"/>
+                <w:color w:val="000000"/>
+                <w:sz w:val="26"/>
+                <w:szCs w:val="44"/>
+              </w:rPr>
+              <w:t>–</w:t>
+            </w:r>
+            <w:r>
+              <w:rPr>
+                <w:rFonts w:ascii="BRH Malayalam Extra" w:hAnsi="BRH Malayalam Extra" w:cs="BRH Malayalam Extra"/>
+                <w:color w:val="000000"/>
+                <w:sz w:val="32"/>
+                <w:szCs w:val="44"/>
+              </w:rPr>
+              <w:t>rõx˜© id¡</w:t>
+            </w:r>
+            <w:r>
+              <w:rPr>
+                <w:rFonts w:ascii="BRH Malayalam Extra" w:hAnsi="BRH Malayalam Extra" w:cs="BRH Malayalam Extra"/>
+                <w:color w:val="000000"/>
+                <w:sz w:val="26"/>
+                <w:szCs w:val="44"/>
+              </w:rPr>
+              <w:t>–</w:t>
+            </w:r>
+            <w:r>
+              <w:rPr>
+                <w:rFonts w:ascii="BRH Malayalam Extra" w:hAnsi="BRH Malayalam Extra" w:cs="BRH Malayalam Extra"/>
+                <w:color w:val="000000"/>
+                <w:sz w:val="32"/>
+                <w:szCs w:val="44"/>
+              </w:rPr>
+              <w:t>rõx˜© põx</w:t>
+            </w:r>
+            <w:r>
+              <w:rPr>
+                <w:rFonts w:ascii="BRH Malayalam Extra" w:hAnsi="BRH Malayalam Extra" w:cs="BRH Malayalam Extra"/>
+                <w:color w:val="000000"/>
+                <w:sz w:val="26"/>
+                <w:szCs w:val="44"/>
+              </w:rPr>
+              <w:t>–</w:t>
+            </w:r>
+            <w:r>
+              <w:rPr>
+                <w:rFonts w:ascii="BRH Malayalam Extra" w:hAnsi="BRH Malayalam Extra" w:cs="BRH Malayalam Extra"/>
+                <w:color w:val="000000"/>
+                <w:sz w:val="32"/>
+                <w:szCs w:val="44"/>
+              </w:rPr>
+              <w:t>¥dd— põx</w:t>
+            </w:r>
+            <w:r>
+              <w:rPr>
+                <w:rFonts w:ascii="BRH Malayalam Extra" w:hAnsi="BRH Malayalam Extra" w:cs="BRH Malayalam Extra"/>
+                <w:color w:val="000000"/>
+                <w:sz w:val="26"/>
+                <w:szCs w:val="44"/>
+              </w:rPr>
+              <w:t>–</w:t>
+            </w:r>
+            <w:r>
+              <w:rPr>
+                <w:rFonts w:ascii="BRH Malayalam Extra" w:hAnsi="BRH Malayalam Extra" w:cs="BRH Malayalam Extra"/>
+                <w:color w:val="000000"/>
+                <w:sz w:val="32"/>
+                <w:szCs w:val="44"/>
+              </w:rPr>
+              <w:t>¥dd— id¡</w:t>
+            </w:r>
+            <w:r>
+              <w:rPr>
+                <w:rFonts w:ascii="BRH Malayalam Extra" w:hAnsi="BRH Malayalam Extra" w:cs="BRH Malayalam Extra"/>
+                <w:color w:val="000000"/>
+                <w:sz w:val="26"/>
+                <w:szCs w:val="44"/>
+              </w:rPr>
+              <w:t>–</w:t>
+            </w:r>
+            <w:r>
+              <w:rPr>
+                <w:rFonts w:ascii="BRH Malayalam Extra" w:hAnsi="BRH Malayalam Extra" w:cs="BRH Malayalam Extra"/>
+                <w:color w:val="000000"/>
+                <w:sz w:val="32"/>
+                <w:szCs w:val="44"/>
+                <w:highlight w:val="green"/>
+              </w:rPr>
+              <w:t>rõx©—.</w:t>
+            </w:r>
+            <w:r>
+              <w:rPr>
+                <w:rFonts w:ascii="BRH Malayalam Extra" w:hAnsi="BRH Malayalam Extra" w:cs="BRH Malayalam Extra"/>
+                <w:color w:val="000000"/>
+                <w:sz w:val="32"/>
+                <w:szCs w:val="44"/>
+              </w:rPr>
+              <w:t xml:space="preserve"> jxI </w:t>
+            </w:r>
+            <w:r>
+              <w:rPr>
+                <w:rFonts w:ascii="BRH Devanagari Extra" w:hAnsi="BRH Devanagari Extra" w:cs="BRH Malayalam Extra"/>
+                <w:color w:val="000000"/>
+                <w:szCs w:val="44"/>
+              </w:rPr>
+              <w:t>Æ</w:t>
+            </w:r>
+            <w:r>
+              <w:rPr>
+                <w:rFonts w:ascii="BRH Malayalam Extra" w:hAnsi="BRH Malayalam Extra" w:cs="BRH Malayalam Extra"/>
+                <w:color w:val="000000"/>
+                <w:sz w:val="32"/>
+                <w:szCs w:val="44"/>
+              </w:rPr>
+              <w:t>jxI i—d¡</w:t>
+            </w:r>
+            <w:r>
+              <w:rPr>
+                <w:rFonts w:ascii="BRH Malayalam Extra" w:hAnsi="BRH Malayalam Extra" w:cs="BRH Malayalam Extra"/>
+                <w:color w:val="000000"/>
+                <w:sz w:val="26"/>
+                <w:szCs w:val="44"/>
+              </w:rPr>
+              <w:t>–</w:t>
+            </w:r>
+            <w:r>
+              <w:rPr>
+                <w:rFonts w:ascii="BRH Malayalam Extra" w:hAnsi="BRH Malayalam Extra" w:cs="BRH Malayalam Extra"/>
+                <w:color w:val="000000"/>
+                <w:sz w:val="32"/>
+                <w:szCs w:val="44"/>
+              </w:rPr>
+              <w:t>rõx˜© põx</w:t>
+            </w:r>
+            <w:r>
+              <w:rPr>
+                <w:rFonts w:ascii="BRH Malayalam Extra" w:hAnsi="BRH Malayalam Extra" w:cs="BRH Malayalam Extra"/>
+                <w:color w:val="000000"/>
+                <w:sz w:val="26"/>
+                <w:szCs w:val="44"/>
+              </w:rPr>
+              <w:t>–</w:t>
+            </w:r>
+            <w:r>
+              <w:rPr>
+                <w:rFonts w:ascii="BRH Malayalam Extra" w:hAnsi="BRH Malayalam Extra" w:cs="BRH Malayalam Extra"/>
+                <w:color w:val="000000"/>
+                <w:sz w:val="32"/>
+                <w:szCs w:val="44"/>
+              </w:rPr>
+              <w:t>¥dd— põx</w:t>
+            </w:r>
+            <w:r>
+              <w:rPr>
+                <w:rFonts w:ascii="BRH Malayalam Extra" w:hAnsi="BRH Malayalam Extra" w:cs="BRH Malayalam Extra"/>
+                <w:color w:val="000000"/>
+                <w:sz w:val="26"/>
+                <w:szCs w:val="44"/>
+              </w:rPr>
+              <w:t>–</w:t>
+            </w:r>
+            <w:r>
+              <w:rPr>
+                <w:rFonts w:ascii="BRH Malayalam Extra" w:hAnsi="BRH Malayalam Extra" w:cs="BRH Malayalam Extra"/>
+                <w:color w:val="000000"/>
+                <w:sz w:val="32"/>
+                <w:szCs w:val="44"/>
+              </w:rPr>
+              <w:t>¥dd— id¡</w:t>
+            </w:r>
+            <w:r>
+              <w:rPr>
+                <w:rFonts w:ascii="BRH Malayalam Extra" w:hAnsi="BRH Malayalam Extra" w:cs="BRH Malayalam Extra"/>
+                <w:color w:val="000000"/>
+                <w:sz w:val="26"/>
+                <w:szCs w:val="44"/>
+              </w:rPr>
+              <w:t>–</w:t>
+            </w:r>
+            <w:r>
+              <w:rPr>
+                <w:rFonts w:ascii="BRH Malayalam Extra" w:hAnsi="BRH Malayalam Extra" w:cs="BRH Malayalam Extra"/>
+                <w:color w:val="000000"/>
+                <w:sz w:val="32"/>
+                <w:szCs w:val="44"/>
+                <w:highlight w:val="green"/>
+              </w:rPr>
+              <w:t>rõx©—.</w:t>
+            </w:r>
+            <w:r>
+              <w:rPr>
+                <w:rFonts w:ascii="BRH Malayalam Extra" w:hAnsi="BRH Malayalam Extra" w:cs="BRH Malayalam Extra"/>
+                <w:color w:val="000000"/>
+                <w:sz w:val="32"/>
+                <w:szCs w:val="44"/>
+              </w:rPr>
+              <w:t xml:space="preserve"> jxI | </w:t>
+            </w:r>
+          </w:p>
+          <w:p>
+            <w:pPr>
+              <w:widowControl w:val="0"/>
+              <w:autoSpaceDE w:val="0"/>
+              <w:autoSpaceDN w:val="0"/>
+              <w:adjustRightInd w:val="0"/>
+              <w:spacing w:before="0" w:line="240" w:lineRule="auto"/>
+              <w:rPr>
+                <w:rFonts w:ascii="BRH Malayalam Extra" w:hAnsi="BRH Malayalam Extra" w:cs="BRH Malayalam Extra"/>
+                <w:color w:val="000000"/>
+                <w:sz w:val="32"/>
+                <w:szCs w:val="44"/>
+              </w:rPr>
+            </w:pPr>
+            <w:r>
+              <w:rPr>
+                <w:rFonts w:cs="BRH Malayalam Extra"/>
+                <w:color w:val="000000"/>
+                <w:szCs w:val="44"/>
+              </w:rPr>
+              <w:t>23</w:t>
+            </w:r>
+            <w:r>
+              <w:rPr>
+                <w:rFonts w:ascii="BRH Malayalam Extra" w:hAnsi="BRH Malayalam Extra" w:cs="BRH Malayalam Extra"/>
+                <w:color w:val="000000"/>
+                <w:sz w:val="32"/>
+                <w:szCs w:val="44"/>
+              </w:rPr>
+              <w:t>)</w:t>
+            </w:r>
+            <w:r>
+              <w:rPr>
+                <w:rFonts w:ascii="BRH Malayalam Extra" w:hAnsi="BRH Malayalam Extra" w:cs="BRH Malayalam Extra"/>
+                <w:color w:val="000000"/>
+                <w:sz w:val="32"/>
+                <w:szCs w:val="44"/>
+              </w:rPr>
+              <w:tab/>
+            </w:r>
+            <w:r>
+              <w:rPr>
+                <w:rFonts w:cs="BRH Malayalam Extra"/>
+                <w:color w:val="000000"/>
+                <w:szCs w:val="44"/>
+              </w:rPr>
+              <w:t>1</w:t>
+            </w:r>
+            <w:r>
+              <w:rPr>
+                <w:rFonts w:ascii="BRH Malayalam Extra" w:hAnsi="BRH Malayalam Extra" w:cs="BRH Malayalam Extra"/>
+                <w:color w:val="000000"/>
+                <w:sz w:val="32"/>
+                <w:szCs w:val="44"/>
+              </w:rPr>
+              <w:t>.</w:t>
+            </w:r>
+            <w:r>
+              <w:rPr>
+                <w:rFonts w:cs="BRH Malayalam Extra"/>
+                <w:color w:val="000000"/>
+                <w:szCs w:val="44"/>
+              </w:rPr>
+              <w:t>7</w:t>
+            </w:r>
+            <w:r>
+              <w:rPr>
+                <w:rFonts w:ascii="BRH Malayalam Extra" w:hAnsi="BRH Malayalam Extra" w:cs="BRH Malayalam Extra"/>
+                <w:color w:val="000000"/>
+                <w:sz w:val="32"/>
+                <w:szCs w:val="44"/>
+              </w:rPr>
+              <w:t>.</w:t>
+            </w:r>
+            <w:r>
+              <w:rPr>
+                <w:rFonts w:cs="BRH Malayalam Extra"/>
+                <w:color w:val="000000"/>
+                <w:szCs w:val="44"/>
+              </w:rPr>
+              <w:t>2</w:t>
+            </w:r>
+            <w:r>
+              <w:rPr>
+                <w:rFonts w:ascii="BRH Malayalam Extra" w:hAnsi="BRH Malayalam Extra" w:cs="BRH Malayalam Extra"/>
+                <w:color w:val="000000"/>
+                <w:sz w:val="32"/>
+                <w:szCs w:val="44"/>
+              </w:rPr>
+              <w:t>.</w:t>
+            </w:r>
+            <w:r>
+              <w:rPr>
+                <w:rFonts w:cs="BRH Malayalam Extra"/>
+                <w:color w:val="000000"/>
+                <w:szCs w:val="44"/>
+              </w:rPr>
+              <w:t>2</w:t>
+            </w:r>
+            <w:r>
+              <w:rPr>
+                <w:rFonts w:ascii="BRH Malayalam Extra" w:hAnsi="BRH Malayalam Extra" w:cs="BRH Malayalam Extra"/>
+                <w:color w:val="000000"/>
+                <w:sz w:val="32"/>
+                <w:szCs w:val="44"/>
+              </w:rPr>
+              <w:t>(</w:t>
+            </w:r>
+            <w:r>
+              <w:rPr>
+                <w:rFonts w:cs="BRH Malayalam Extra"/>
+                <w:color w:val="000000"/>
+                <w:szCs w:val="44"/>
+              </w:rPr>
+              <w:t>21</w:t>
+            </w:r>
+            <w:r>
+              <w:rPr>
+                <w:rFonts w:ascii="BRH Malayalam Extra" w:hAnsi="BRH Malayalam Extra" w:cs="BRH Malayalam Extra"/>
+                <w:color w:val="000000"/>
+                <w:sz w:val="32"/>
+                <w:szCs w:val="44"/>
+              </w:rPr>
+              <w:t>)</w:t>
+            </w:r>
+            <w:proofErr w:type="gramStart"/>
+            <w:r>
+              <w:rPr>
+                <w:rFonts w:ascii="BRH Malayalam Extra" w:hAnsi="BRH Malayalam Extra" w:cs="BRH Malayalam Extra"/>
+                <w:color w:val="000000"/>
+                <w:sz w:val="32"/>
+                <w:szCs w:val="44"/>
+              </w:rPr>
+              <w:t>-  i</w:t>
+            </w:r>
+            <w:proofErr w:type="gramEnd"/>
+            <w:r>
+              <w:rPr>
+                <w:rFonts w:ascii="BRH Malayalam Extra" w:hAnsi="BRH Malayalam Extra" w:cs="BRH Malayalam Extra"/>
+                <w:color w:val="000000"/>
+                <w:sz w:val="26"/>
+                <w:szCs w:val="44"/>
+              </w:rPr>
+              <w:t>–</w:t>
+            </w:r>
+            <w:r>
+              <w:rPr>
+                <w:rFonts w:ascii="BRH Malayalam Extra" w:hAnsi="BRH Malayalam Extra" w:cs="BRH Malayalam Extra"/>
+                <w:color w:val="000000"/>
+                <w:sz w:val="32"/>
+                <w:szCs w:val="44"/>
+              </w:rPr>
+              <w:t>d¡</w:t>
+            </w:r>
+            <w:r>
+              <w:rPr>
+                <w:rFonts w:ascii="BRH Malayalam Extra" w:hAnsi="BRH Malayalam Extra" w:cs="BRH Malayalam Extra"/>
+                <w:color w:val="000000"/>
+                <w:sz w:val="26"/>
+                <w:szCs w:val="44"/>
+              </w:rPr>
+              <w:t>–</w:t>
+            </w:r>
+            <w:r>
+              <w:rPr>
+                <w:rFonts w:ascii="BRH Malayalam Extra" w:hAnsi="BRH Malayalam Extra" w:cs="BRH Malayalam Extra"/>
+                <w:color w:val="000000"/>
+                <w:sz w:val="32"/>
+                <w:szCs w:val="44"/>
+              </w:rPr>
+              <w:t>rõx©— | jxI | ey</w:t>
+            </w:r>
+            <w:r>
+              <w:rPr>
+                <w:rFonts w:ascii="BRH Malayalam Extra" w:hAnsi="BRH Malayalam Extra" w:cs="BRH Malayalam Extra"/>
+                <w:color w:val="000000"/>
+                <w:sz w:val="26"/>
+                <w:szCs w:val="44"/>
+              </w:rPr>
+              <w:t>–</w:t>
+            </w:r>
+            <w:r>
+              <w:rPr>
+                <w:rFonts w:ascii="BRH Malayalam Extra" w:hAnsi="BRH Malayalam Extra" w:cs="BRH Malayalam Extra"/>
+                <w:color w:val="000000"/>
+                <w:sz w:val="32"/>
+                <w:szCs w:val="44"/>
+              </w:rPr>
+              <w:t>Z£hõ—J |</w:t>
+            </w:r>
+          </w:p>
+          <w:p>
+            <w:pPr>
+              <w:widowControl w:val="0"/>
+              <w:autoSpaceDE w:val="0"/>
+              <w:autoSpaceDN w:val="0"/>
+              <w:adjustRightInd w:val="0"/>
+              <w:spacing w:before="0" w:line="240" w:lineRule="auto"/>
+              <w:rPr>
+                <w:rFonts w:ascii="BRH Malayalam Extra" w:hAnsi="BRH Malayalam Extra" w:cs="BRH Malayalam Extra"/>
+                <w:color w:val="000000"/>
+                <w:sz w:val="32"/>
+                <w:szCs w:val="44"/>
+              </w:rPr>
+            </w:pPr>
+            <w:r>
+              <w:rPr>
+                <w:rFonts w:ascii="BRH Malayalam Extra" w:hAnsi="BRH Malayalam Extra" w:cs="BRH Malayalam Extra"/>
+                <w:color w:val="000000"/>
+                <w:sz w:val="32"/>
+                <w:szCs w:val="44"/>
+              </w:rPr>
+              <w:t>i</w:t>
+            </w:r>
+            <w:r>
+              <w:rPr>
+                <w:rFonts w:ascii="BRH Malayalam Extra" w:hAnsi="BRH Malayalam Extra" w:cs="BRH Malayalam Extra"/>
+                <w:color w:val="000000"/>
+                <w:sz w:val="26"/>
+                <w:szCs w:val="44"/>
+              </w:rPr>
+              <w:t>–</w:t>
+            </w:r>
+            <w:r>
+              <w:rPr>
+                <w:rFonts w:ascii="BRH Malayalam Extra" w:hAnsi="BRH Malayalam Extra" w:cs="BRH Malayalam Extra"/>
+                <w:color w:val="000000"/>
+                <w:sz w:val="32"/>
+                <w:szCs w:val="44"/>
+              </w:rPr>
+              <w:t>d¡</w:t>
+            </w:r>
+            <w:r>
+              <w:rPr>
+                <w:rFonts w:ascii="BRH Malayalam Extra" w:hAnsi="BRH Malayalam Extra" w:cs="BRH Malayalam Extra"/>
+                <w:color w:val="000000"/>
+                <w:sz w:val="26"/>
+                <w:szCs w:val="44"/>
+              </w:rPr>
+              <w:t>–</w:t>
+            </w:r>
+            <w:r>
+              <w:rPr>
+                <w:rFonts w:ascii="BRH Malayalam Extra" w:hAnsi="BRH Malayalam Extra" w:cs="BRH Malayalam Extra"/>
+                <w:color w:val="000000"/>
+                <w:sz w:val="32"/>
+                <w:szCs w:val="44"/>
+                <w:highlight w:val="green"/>
+              </w:rPr>
+              <w:t>rõx©—.</w:t>
+            </w:r>
+            <w:r>
+              <w:rPr>
+                <w:rFonts w:ascii="BRH Malayalam Extra" w:hAnsi="BRH Malayalam Extra" w:cs="BRH Malayalam Extra"/>
+                <w:color w:val="000000"/>
+                <w:sz w:val="32"/>
+                <w:szCs w:val="44"/>
+              </w:rPr>
+              <w:t xml:space="preserve"> </w:t>
+            </w:r>
+            <w:r>
+              <w:rPr>
+                <w:rFonts w:ascii="BRH Malayalam Extra" w:hAnsi="BRH Malayalam Extra" w:cs="BRH Malayalam Extra"/>
+                <w:color w:val="000000"/>
+                <w:sz w:val="32"/>
+                <w:szCs w:val="44"/>
+              </w:rPr>
+              <w:t xml:space="preserve">jxI </w:t>
+            </w:r>
+            <w:r>
+              <w:rPr>
+                <w:rFonts w:ascii="BRH Devanagari Extra" w:hAnsi="BRH Devanagari Extra" w:cs="BRH Malayalam Extra"/>
+                <w:color w:val="000000"/>
+                <w:szCs w:val="44"/>
+              </w:rPr>
+              <w:t>Æ</w:t>
+            </w:r>
+            <w:r>
+              <w:rPr>
+                <w:rFonts w:ascii="BRH Malayalam Extra" w:hAnsi="BRH Malayalam Extra" w:cs="BRH Malayalam Extra"/>
+                <w:color w:val="000000"/>
+                <w:sz w:val="32"/>
+                <w:szCs w:val="44"/>
+              </w:rPr>
+              <w:t>jxI i—d¡</w:t>
+            </w:r>
+            <w:r>
+              <w:rPr>
+                <w:rFonts w:ascii="BRH Malayalam Extra" w:hAnsi="BRH Malayalam Extra" w:cs="BRH Malayalam Extra"/>
+                <w:color w:val="000000"/>
+                <w:sz w:val="26"/>
+                <w:szCs w:val="44"/>
+              </w:rPr>
+              <w:t>–</w:t>
+            </w:r>
+            <w:r>
+              <w:rPr>
+                <w:rFonts w:ascii="BRH Malayalam Extra" w:hAnsi="BRH Malayalam Extra" w:cs="BRH Malayalam Extra"/>
+                <w:color w:val="000000"/>
+                <w:sz w:val="32"/>
+                <w:szCs w:val="44"/>
+              </w:rPr>
+              <w:t>rõx˜© id¡</w:t>
+            </w:r>
+            <w:r>
+              <w:rPr>
+                <w:rFonts w:ascii="BRH Malayalam Extra" w:hAnsi="BRH Malayalam Extra" w:cs="BRH Malayalam Extra"/>
+                <w:color w:val="000000"/>
+                <w:sz w:val="26"/>
+                <w:szCs w:val="44"/>
+              </w:rPr>
+              <w:t>–</w:t>
+            </w:r>
+            <w:r>
+              <w:rPr>
+                <w:rFonts w:ascii="BRH Malayalam Extra" w:hAnsi="BRH Malayalam Extra" w:cs="BRH Malayalam Extra"/>
+                <w:color w:val="000000"/>
+                <w:sz w:val="32"/>
+                <w:szCs w:val="44"/>
+                <w:highlight w:val="green"/>
+              </w:rPr>
+              <w:t>rõx©—.</w:t>
+            </w:r>
+            <w:r>
+              <w:rPr>
+                <w:rFonts w:ascii="BRH Malayalam Extra" w:hAnsi="BRH Malayalam Extra" w:cs="BRH Malayalam Extra"/>
+                <w:color w:val="000000"/>
+                <w:sz w:val="32"/>
+                <w:szCs w:val="44"/>
+              </w:rPr>
+              <w:t xml:space="preserve"> jxI </w:t>
+            </w:r>
+          </w:p>
+          <w:p>
+            <w:pPr>
+              <w:widowControl w:val="0"/>
+              <w:autoSpaceDE w:val="0"/>
+              <w:autoSpaceDN w:val="0"/>
+              <w:adjustRightInd w:val="0"/>
+              <w:spacing w:before="0" w:line="240" w:lineRule="auto"/>
+              <w:rPr>
+                <w:rFonts w:cs="BRH Malayalam Extra"/>
+                <w:color w:val="000000"/>
+                <w:szCs w:val="44"/>
+              </w:rPr>
+            </w:pPr>
+            <w:r>
+              <w:rPr>
+                <w:rFonts w:ascii="BRH Malayalam Extra" w:hAnsi="BRH Malayalam Extra" w:cs="BRH Malayalam Extra"/>
+                <w:color w:val="000000"/>
+                <w:sz w:val="32"/>
+                <w:szCs w:val="44"/>
+              </w:rPr>
+              <w:t>ey</w:t>
+            </w:r>
+            <w:r>
+              <w:rPr>
+                <w:rFonts w:ascii="BRH Malayalam Extra" w:hAnsi="BRH Malayalam Extra" w:cs="BRH Malayalam Extra"/>
+                <w:color w:val="000000"/>
+                <w:sz w:val="26"/>
+                <w:szCs w:val="44"/>
+              </w:rPr>
+              <w:t>–</w:t>
+            </w:r>
+            <w:r>
+              <w:rPr>
+                <w:rFonts w:ascii="BRH Malayalam Extra" w:hAnsi="BRH Malayalam Extra" w:cs="BRH Malayalam Extra"/>
+                <w:color w:val="000000"/>
+                <w:sz w:val="32"/>
+                <w:szCs w:val="44"/>
+              </w:rPr>
+              <w:t>Z£hõ—J ey</w:t>
+            </w:r>
+            <w:r>
+              <w:rPr>
+                <w:rFonts w:ascii="BRH Malayalam Extra" w:hAnsi="BRH Malayalam Extra" w:cs="BRH Malayalam Extra"/>
+                <w:color w:val="000000"/>
+                <w:sz w:val="26"/>
+                <w:szCs w:val="44"/>
+              </w:rPr>
+              <w:t>–</w:t>
+            </w:r>
+            <w:r>
+              <w:rPr>
+                <w:rFonts w:ascii="BRH Malayalam Extra" w:hAnsi="BRH Malayalam Extra" w:cs="BRH Malayalam Extra"/>
+                <w:color w:val="000000"/>
+                <w:sz w:val="32"/>
+                <w:szCs w:val="44"/>
+              </w:rPr>
+              <w:t>Z£¥hõx</w:t>
+            </w:r>
+            <w:r>
+              <w:rPr>
+                <w:rFonts w:ascii="BRH Malayalam Extra" w:hAnsi="BRH Malayalam Extra" w:cs="BRH Malayalam Extra"/>
+                <w:color w:val="000000"/>
+                <w:sz w:val="26"/>
+                <w:szCs w:val="44"/>
+              </w:rPr>
+              <w:t>–</w:t>
+            </w:r>
+            <w:r>
+              <w:rPr>
+                <w:rFonts w:ascii="BRH Malayalam Extra" w:hAnsi="BRH Malayalam Extra" w:cs="BRH Malayalam Extra"/>
+                <w:color w:val="000000"/>
+                <w:sz w:val="32"/>
+                <w:szCs w:val="44"/>
+              </w:rPr>
+              <w:t xml:space="preserve"> jxI i—d¡</w:t>
+            </w:r>
+            <w:r>
+              <w:rPr>
+                <w:rFonts w:ascii="BRH Malayalam Extra" w:hAnsi="BRH Malayalam Extra" w:cs="BRH Malayalam Extra"/>
+                <w:color w:val="000000"/>
+                <w:sz w:val="26"/>
+                <w:szCs w:val="44"/>
+              </w:rPr>
+              <w:t>–</w:t>
+            </w:r>
+            <w:r>
+              <w:rPr>
+                <w:rFonts w:ascii="BRH Malayalam Extra" w:hAnsi="BRH Malayalam Extra" w:cs="BRH Malayalam Extra"/>
+                <w:color w:val="000000"/>
+                <w:sz w:val="32"/>
+                <w:szCs w:val="44"/>
+              </w:rPr>
+              <w:t>rõx˜© id¡</w:t>
+            </w:r>
+            <w:r>
+              <w:rPr>
+                <w:rFonts w:ascii="BRH Malayalam Extra" w:hAnsi="BRH Malayalam Extra" w:cs="BRH Malayalam Extra"/>
+                <w:color w:val="000000"/>
+                <w:sz w:val="26"/>
+                <w:szCs w:val="44"/>
+              </w:rPr>
+              <w:t>–</w:t>
+            </w:r>
+            <w:r>
+              <w:rPr>
+                <w:rFonts w:ascii="BRH Malayalam Extra" w:hAnsi="BRH Malayalam Extra" w:cs="BRH Malayalam Extra"/>
+                <w:color w:val="000000"/>
+                <w:sz w:val="32"/>
+                <w:szCs w:val="44"/>
+                <w:highlight w:val="green"/>
+              </w:rPr>
+              <w:t>rõx©—.</w:t>
+            </w:r>
+            <w:r>
+              <w:rPr>
+                <w:rFonts w:ascii="BRH Malayalam Extra" w:hAnsi="BRH Malayalam Extra" w:cs="BRH Malayalam Extra"/>
+                <w:color w:val="000000"/>
+                <w:sz w:val="32"/>
+                <w:szCs w:val="44"/>
+              </w:rPr>
+              <w:t xml:space="preserve"> jxI ey</w:t>
+            </w:r>
+            <w:r>
+              <w:rPr>
+                <w:rFonts w:ascii="BRH Malayalam Extra" w:hAnsi="BRH Malayalam Extra" w:cs="BRH Malayalam Extra"/>
+                <w:color w:val="000000"/>
+                <w:sz w:val="26"/>
+                <w:szCs w:val="44"/>
+              </w:rPr>
+              <w:t>–</w:t>
+            </w:r>
+            <w:r>
+              <w:rPr>
+                <w:rFonts w:ascii="BRH Malayalam Extra" w:hAnsi="BRH Malayalam Extra" w:cs="BRH Malayalam Extra"/>
+                <w:color w:val="000000"/>
+                <w:sz w:val="32"/>
+                <w:szCs w:val="44"/>
+              </w:rPr>
+              <w:t xml:space="preserve">Z£hõ—J | </w:t>
+            </w:r>
+          </w:p>
+        </w:tc>
+      </w:tr>
+      <w:tr>
+        <w:trPr>
+          <w:trHeight w:val="1368"/>
+        </w:trPr>
+        <w:tc>
+          <w:tcPr>
+            <w:tcW w:w="7401" w:type="dxa"/>
+          </w:tcPr>
+          <w:p>
+            <w:pPr>
+              <w:widowControl w:val="0"/>
+              <w:autoSpaceDE w:val="0"/>
+              <w:autoSpaceDN w:val="0"/>
+              <w:adjustRightInd w:val="0"/>
               <w:spacing w:line="240" w:lineRule="auto"/>
               <w:rPr>
                 <w:rFonts w:ascii="BRH Malayalam Extra" w:hAnsi="BRH Malayalam Extra" w:cs="BRH Malayalam Extra"/>
@@ -977,6 +2999,7 @@
                 <w:sz w:val="32"/>
                 <w:szCs w:val="44"/>
               </w:rPr>
+              <w:lastRenderedPageBreak/>
               <w:t>px¥R—r¡ pxRy</w:t>
             </w:r>
             <w:r>
@@ -1870,7 +3893,6 @@
                 <w:color w:val="000000"/>
                 <w:szCs w:val="44"/>
               </w:rPr>
-              <w:lastRenderedPageBreak/>
               <w:t>36</w:t>
             </w:r>
             <w:r>
@@ -3034,6 +5056,7 @@
                 <w:sz w:val="32"/>
                 <w:szCs w:val="44"/>
               </w:rPr>
+              <w:lastRenderedPageBreak/>
               <w:t>px¥R—r¡ pxRy</w:t>
             </w:r>
             <w:r>
@@ -3888,7 +5911,6 @@
                 <w:color w:val="000000"/>
                 <w:szCs w:val="44"/>
               </w:rPr>
-              <w:lastRenderedPageBreak/>
               <w:t>36</w:t>
             </w:r>
             <w:r>
@@ -5732,7 +7754,6 @@
                 <w:rFonts w:cs="BRH Malayalam Extra"/>
                 <w:szCs w:val="44"/>
               </w:rPr>
-              <w:lastRenderedPageBreak/>
               <w:t>48</w:t>
             </w:r>
             <w:r>
@@ -7332,6 +9353,7 @@
                 <w:szCs w:val="44"/>
                 <w:lang w:val="it-IT"/>
               </w:rPr>
+              <w:lastRenderedPageBreak/>
               <w:t>5</w:t>
             </w:r>
             <w:r>
@@ -9091,7 +11113,6 @@
                 <w:szCs w:val="44"/>
                 <w:lang w:val="it-IT"/>
               </w:rPr>
-              <w:lastRenderedPageBreak/>
               <w:t>4</w:t>
             </w:r>
             <w:r>
@@ -9874,7 +11895,6 @@
                 <w:szCs w:val="44"/>
                 <w:lang w:val="it-IT"/>
               </w:rPr>
-              <w:lastRenderedPageBreak/>
               <w:t>3</w:t>
             </w:r>
             <w:r>
@@ -10152,7 +12172,6 @@
                 <w:szCs w:val="44"/>
                 <w:lang w:val="it-IT"/>
               </w:rPr>
-              <w:lastRenderedPageBreak/>
               <w:t>4</w:t>
             </w:r>
             <w:r>
@@ -12776,7 +14795,6 @@
                 <w:rFonts w:cs="BRH Malayalam Extra"/>
                 <w:szCs w:val="44"/>
               </w:rPr>
-              <w:lastRenderedPageBreak/>
               <w:t>42</w:t>
             </w:r>
             <w:r>
@@ -13586,6 +15604,7 @@
                 <w:sz w:val="32"/>
                 <w:szCs w:val="44"/>
               </w:rPr>
+              <w:lastRenderedPageBreak/>
               <w:t>P</w:t>
             </w:r>
             <w:r>
@@ -14058,7 +16077,6 @@
                 <w:rFonts w:cs="BRH Malayalam Extra"/>
                 <w:szCs w:val="44"/>
               </w:rPr>
-              <w:lastRenderedPageBreak/>
               <w:t>42</w:t>
             </w:r>
             <w:r>
@@ -14868,6 +16886,7 @@
                 <w:sz w:val="32"/>
                 <w:szCs w:val="44"/>
               </w:rPr>
+              <w:lastRenderedPageBreak/>
               <w:t>P</w:t>
             </w:r>
             <w:r>
@@ -15682,7 +17701,6 @@
                 <w:rFonts w:cs="BRH Malayalam Extra"/>
                 <w:szCs w:val="44"/>
               </w:rPr>
-              <w:lastRenderedPageBreak/>
               <w:t>5</w:t>
             </w:r>
             <w:r>
@@ -16846,7 +18864,6 @@
                 <w:rFonts w:cs="BRH Malayalam Extra"/>
                 <w:szCs w:val="44"/>
               </w:rPr>
-              <w:lastRenderedPageBreak/>
               <w:t>5</w:t>
             </w:r>
             <w:r>
@@ -17215,7 +19232,6 @@
                 <w:rFonts w:cs="BRH Malayalam Extra"/>
                 <w:szCs w:val="44"/>
               </w:rPr>
-              <w:lastRenderedPageBreak/>
               <w:t>13</w:t>
             </w:r>
             <w:r>
@@ -17574,6 +19590,7 @@
                 <w:sz w:val="32"/>
                 <w:szCs w:val="44"/>
               </w:rPr>
+              <w:lastRenderedPageBreak/>
               <w:t>B</w:t>
             </w:r>
             <w:r>
@@ -17969,6 +19986,7 @@
                 <w:rFonts w:cs="BRH Malayalam Extra"/>
                 <w:szCs w:val="44"/>
               </w:rPr>
+              <w:lastRenderedPageBreak/>
               <w:t>13</w:t>
             </w:r>
             <w:r>
@@ -18327,6 +20345,7 @@
                 <w:sz w:val="32"/>
                 <w:szCs w:val="44"/>
               </w:rPr>
+              <w:lastRenderedPageBreak/>
               <w:t>B</w:t>
             </w:r>
             <w:r>
@@ -18727,6 +20746,7 @@
                 <w:rFonts w:cs="BRH Malayalam Extra"/>
                 <w:szCs w:val="44"/>
               </w:rPr>
+              <w:lastRenderedPageBreak/>
               <w:t>37</w:t>
             </w:r>
             <w:r>
@@ -19298,7 +21318,6 @@
                 <w:rFonts w:cs="BRH Malayalam Extra"/>
                 <w:szCs w:val="44"/>
               </w:rPr>
-              <w:lastRenderedPageBreak/>
               <w:t>60</w:t>
             </w:r>
             <w:r>
@@ -20871,6 +22890,7 @@
                 <w:sz w:val="28"/>
                 <w:szCs w:val="28"/>
               </w:rPr>
+              <w:lastRenderedPageBreak/>
               <w:t>75)</w:t>
             </w:r>
             <w:r>
@@ -21878,16 +23898,7 @@
                 <w:sz w:val="32"/>
                 <w:szCs w:val="44"/>
               </w:rPr>
-              <w:t xml:space="preserve">pZy— </w:t>
-            </w:r>
-            <w:r>
-              <w:rPr>
-                <w:rFonts w:ascii="BRH Malayalam Extra" w:hAnsi="BRH Malayalam Extra" w:cs="BRH Malayalam Extra"/>
-                <w:sz w:val="32"/>
-                <w:szCs w:val="44"/>
-              </w:rPr>
-              <w:lastRenderedPageBreak/>
-              <w:t>pxRydz</w:t>
+              <w:t>pZy— pxRydz</w:t>
             </w:r>
             <w:r>
               <w:rPr>
@@ -21958,7 +23969,6 @@
                 <w:rFonts w:cs="BRH Malayalam Extra"/>
                 <w:szCs w:val="44"/>
               </w:rPr>
-              <w:lastRenderedPageBreak/>
               <w:t>34</w:t>
             </w:r>
             <w:r>
@@ -22723,16 +24733,7 @@
                 <w:sz w:val="32"/>
                 <w:szCs w:val="44"/>
               </w:rPr>
-              <w:t xml:space="preserve">pZy— </w:t>
-            </w:r>
-            <w:r>
-              <w:rPr>
-                <w:rFonts w:ascii="BRH Malayalam Extra" w:hAnsi="BRH Malayalam Extra" w:cs="BRH Malayalam Extra"/>
-                <w:sz w:val="32"/>
-                <w:szCs w:val="44"/>
-              </w:rPr>
-              <w:lastRenderedPageBreak/>
-              <w:t>pxRydz</w:t>
+              <w:t>pZy— pxRydz</w:t>
             </w:r>
             <w:r>
               <w:rPr>
@@ -27214,7 +29215,6 @@
                 <w:rFonts w:cs="BRH Malayalam Extra"/>
                 <w:szCs w:val="44"/>
               </w:rPr>
-              <w:lastRenderedPageBreak/>
               <w:t>9</w:t>
             </w:r>
             <w:r>
@@ -27605,7 +29605,16 @@
                 <w:sz w:val="32"/>
                 <w:szCs w:val="44"/>
               </w:rPr>
-              <w:t>¥Zx pxRy—¥dx</w:t>
+              <w:t xml:space="preserve">¥Zx </w:t>
+            </w:r>
+            <w:r>
+              <w:rPr>
+                <w:rFonts w:ascii="BRH Malayalam Extra" w:hAnsi="BRH Malayalam Extra" w:cs="BRH Malayalam Extra"/>
+                <w:sz w:val="32"/>
+                <w:szCs w:val="44"/>
+              </w:rPr>
+              <w:lastRenderedPageBreak/>
+              <w:t>pxRy—¥dx</w:t>
             </w:r>
             <w:r>
               <w:rPr>
@@ -28559,6 +30568,7 @@
                 <w:rFonts w:cs="BRH Malayalam Extra"/>
                 <w:szCs w:val="44"/>
               </w:rPr>
+              <w:lastRenderedPageBreak/>
               <w:t>9</w:t>
             </w:r>
             <w:r>
@@ -28931,7 +30941,16 @@
                 <w:sz w:val="32"/>
                 <w:szCs w:val="44"/>
               </w:rPr>
-              <w:t xml:space="preserve"> pxRy—¥dx</w:t>
+              <w:t xml:space="preserve"> </w:t>
+            </w:r>
+            <w:r>
+              <w:rPr>
+                <w:rFonts w:ascii="BRH Malayalam Extra" w:hAnsi="BRH Malayalam Extra" w:cs="BRH Malayalam Extra"/>
+                <w:sz w:val="32"/>
+                <w:szCs w:val="44"/>
+              </w:rPr>
+              <w:lastRenderedPageBreak/>
+              <w:t>pxRy—¥dx</w:t>
             </w:r>
             <w:r>
               <w:rPr>
@@ -29830,6 +31849,7 @@
                 <w:rFonts w:cs="BRH Malayalam Extra"/>
                 <w:szCs w:val="44"/>
               </w:rPr>
+              <w:lastRenderedPageBreak/>
               <w:t>19</w:t>
             </w:r>
             <w:r>
@@ -30590,7 +32610,6 @@
                 <w:sz w:val="32"/>
                 <w:szCs w:val="44"/>
               </w:rPr>
-              <w:lastRenderedPageBreak/>
               <w:t>pxRy—¥dx pxR</w:t>
             </w:r>
             <w:r>
@@ -30763,6 +32782,7 @@
                 <w:rFonts w:cs="BRH Malayalam Extra"/>
                 <w:szCs w:val="44"/>
               </w:rPr>
+              <w:lastRenderedPageBreak/>
               <w:t>21</w:t>
             </w:r>
             <w:r>
@@ -32468,7 +34488,6 @@
                 <w:sz w:val="32"/>
                 <w:szCs w:val="44"/>
               </w:rPr>
-              <w:lastRenderedPageBreak/>
               <w:t>pxRy—¥dx pxR</w:t>
             </w:r>
             <w:r>
@@ -32642,6 +34661,7 @@
                 <w:rFonts w:cs="BRH Malayalam Extra"/>
                 <w:szCs w:val="44"/>
               </w:rPr>
+              <w:lastRenderedPageBreak/>
               <w:t>21</w:t>
             </w:r>
             <w:r>
@@ -33605,6 +35625,7 @@
                 <w:rFonts w:cs="BRH Malayalam Extra"/>
                 <w:szCs w:val="44"/>
               </w:rPr>
+              <w:lastRenderedPageBreak/>
               <w:t>66</w:t>
             </w:r>
             <w:r>
@@ -35081,7 +37102,6 @@
                 <w:rFonts w:cs="BRH Malayalam Extra"/>
                 <w:szCs w:val="44"/>
               </w:rPr>
-              <w:lastRenderedPageBreak/>
               <w:t>13</w:t>
             </w:r>
             <w:r>
@@ -35475,6 +37495,7 @@
                 <w:rFonts w:ascii="BRH Devanagari Extra" w:hAnsi="BRH Devanagari Extra" w:cs="BRH Malayalam Extra"/>
                 <w:szCs w:val="44"/>
               </w:rPr>
+              <w:lastRenderedPageBreak/>
               <w:t>Æ</w:t>
             </w:r>
             <w:r>
@@ -35978,6 +37999,7 @@
                 <w:rFonts w:cs="BRH Malayalam Extra"/>
                 <w:szCs w:val="44"/>
               </w:rPr>
+              <w:lastRenderedPageBreak/>
               <w:t>13</w:t>
             </w:r>
             <w:r>
@@ -36388,6 +38410,7 @@
                 <w:rFonts w:ascii="BRH Devanagari Extra" w:hAnsi="BRH Devanagari Extra" w:cs="BRH Malayalam Extra"/>
                 <w:szCs w:val="44"/>
               </w:rPr>
+              <w:lastRenderedPageBreak/>
               <w:t>Æ</w:t>
             </w:r>
             <w:r>
@@ -36909,6 +38932,7 @@
                 <w:rFonts w:cs="BRH Malayalam Extra"/>
                 <w:szCs w:val="44"/>
               </w:rPr>
+              <w:lastRenderedPageBreak/>
               <w:t>60</w:t>
             </w:r>
             <w:r>
@@ -42087,6 +44111,7 @@
           <w:szCs w:val="32"/>
           <w:u w:val="single"/>
         </w:rPr>
+        <w:lastRenderedPageBreak/>
         <w:t>TS Ghanam – TS 1.</w:t>
       </w:r>
       <w:r>

</xml_diff>

<commit_message>
nmv 07 06 2025
</commit_message>
<xml_diff>
--- a/TS Jatai Ghanam Project/TS 1.7/TS 1.7 Ghanam Malayalam Corrections.docx
+++ b/TS Jatai Ghanam Project/TS 1.7/TS 1.7 Ghanam Malayalam Corrections.docx
@@ -22,9 +22,8 @@
           <w:szCs w:val="32"/>
           <w:u w:val="single"/>
         </w:rPr>
-        <w:t xml:space="preserve">TS Ghanam – TS 1.7 Malayalam Corrections – Observed </w:t>
+        <w:t xml:space="preserve">TS Ghanam – TS 1.7 Malayalam Corrections – Observed till </w:t>
       </w:r>
-      <w:proofErr w:type="gramStart"/>
       <w:r>
         <w:rPr>
           <w:b/>
@@ -33,29 +32,7 @@
           <w:szCs w:val="32"/>
           <w:u w:val="single"/>
         </w:rPr>
-        <w:t xml:space="preserve">till </w:t>
-      </w:r>
-      <w:r>
-        <w:rPr>
-          <w:b/>
-          <w:bCs/>
-          <w:sz w:val="32"/>
-          <w:szCs w:val="32"/>
-          <w:highlight w:val="red"/>
-          <w:u w:val="single"/>
-        </w:rPr>
-        <w:t>?????</w:t>
-      </w:r>
-      <w:proofErr w:type="gramEnd"/>
-      <w:r>
-        <w:rPr>
-          <w:b/>
-          <w:bCs/>
-          <w:sz w:val="32"/>
-          <w:szCs w:val="32"/>
-          <w:u w:val="single"/>
-        </w:rPr>
-        <w:t xml:space="preserve"> </w:t>
+        <w:t>30th June 2026</w:t>
       </w:r>
     </w:p>
     <w:p>
@@ -3872,21 +3849,6 @@
                 <w:szCs w:val="44"/>
               </w:rPr>
             </w:pPr>
-          </w:p>
-          <w:p>
-            <w:pPr>
-              <w:widowControl w:val="0"/>
-              <w:autoSpaceDE w:val="0"/>
-              <w:autoSpaceDN w:val="0"/>
-              <w:adjustRightInd w:val="0"/>
-              <w:spacing w:line="240" w:lineRule="auto"/>
-              <w:rPr>
-                <w:rFonts w:ascii="BRH Malayalam Extra" w:hAnsi="BRH Malayalam Extra" w:cs="BRH Malayalam Extra"/>
-                <w:color w:val="000000"/>
-                <w:sz w:val="32"/>
-                <w:szCs w:val="44"/>
-              </w:rPr>
-            </w:pPr>
             <w:r>
               <w:rPr>
                 <w:rFonts w:cs="BRH Malayalam Extra"/>
@@ -5890,6 +5852,239 @@
                 <w:szCs w:val="44"/>
               </w:rPr>
             </w:pPr>
+            <w:r>
+              <w:rPr>
+                <w:rFonts w:cs="BRH Malayalam Extra"/>
+                <w:color w:val="000000"/>
+                <w:szCs w:val="44"/>
+              </w:rPr>
+              <w:t>36</w:t>
+            </w:r>
+            <w:r>
+              <w:rPr>
+                <w:rFonts w:ascii="BRH Malayalam Extra" w:hAnsi="BRH Malayalam Extra" w:cs="BRH Malayalam Extra"/>
+                <w:color w:val="000000"/>
+                <w:sz w:val="32"/>
+                <w:szCs w:val="44"/>
+              </w:rPr>
+              <w:t>)</w:t>
+            </w:r>
+            <w:r>
+              <w:rPr>
+                <w:rFonts w:ascii="BRH Malayalam Extra" w:hAnsi="BRH Malayalam Extra" w:cs="BRH Malayalam Extra"/>
+                <w:color w:val="000000"/>
+                <w:sz w:val="32"/>
+                <w:szCs w:val="44"/>
+              </w:rPr>
+              <w:tab/>
+            </w:r>
+            <w:r>
+              <w:rPr>
+                <w:rFonts w:cs="BRH Malayalam Extra"/>
+                <w:color w:val="000000"/>
+                <w:szCs w:val="44"/>
+              </w:rPr>
+              <w:t>1</w:t>
+            </w:r>
+            <w:r>
+              <w:rPr>
+                <w:rFonts w:ascii="BRH Malayalam Extra" w:hAnsi="BRH Malayalam Extra" w:cs="BRH Malayalam Extra"/>
+                <w:color w:val="000000"/>
+                <w:sz w:val="32"/>
+                <w:szCs w:val="44"/>
+              </w:rPr>
+              <w:t>.</w:t>
+            </w:r>
+            <w:r>
+              <w:rPr>
+                <w:rFonts w:cs="BRH Malayalam Extra"/>
+                <w:color w:val="000000"/>
+                <w:szCs w:val="44"/>
+              </w:rPr>
+              <w:t>7</w:t>
+            </w:r>
+            <w:r>
+              <w:rPr>
+                <w:rFonts w:ascii="BRH Malayalam Extra" w:hAnsi="BRH Malayalam Extra" w:cs="BRH Malayalam Extra"/>
+                <w:color w:val="000000"/>
+                <w:sz w:val="32"/>
+                <w:szCs w:val="44"/>
+              </w:rPr>
+              <w:t>.</w:t>
+            </w:r>
+            <w:r>
+              <w:rPr>
+                <w:rFonts w:cs="BRH Malayalam Extra"/>
+                <w:color w:val="000000"/>
+                <w:szCs w:val="44"/>
+              </w:rPr>
+              <w:t>8</w:t>
+            </w:r>
+            <w:r>
+              <w:rPr>
+                <w:rFonts w:ascii="BRH Malayalam Extra" w:hAnsi="BRH Malayalam Extra" w:cs="BRH Malayalam Extra"/>
+                <w:color w:val="000000"/>
+                <w:sz w:val="32"/>
+                <w:szCs w:val="44"/>
+              </w:rPr>
+              <w:t>.</w:t>
+            </w:r>
+            <w:r>
+              <w:rPr>
+                <w:rFonts w:cs="BRH Malayalam Extra"/>
+                <w:color w:val="000000"/>
+                <w:szCs w:val="44"/>
+              </w:rPr>
+              <w:t>1</w:t>
+            </w:r>
+            <w:r>
+              <w:rPr>
+                <w:rFonts w:ascii="BRH Malayalam Extra" w:hAnsi="BRH Malayalam Extra" w:cs="BRH Malayalam Extra"/>
+                <w:color w:val="000000"/>
+                <w:sz w:val="32"/>
+                <w:szCs w:val="44"/>
+              </w:rPr>
+              <w:t>(</w:t>
+            </w:r>
+            <w:r>
+              <w:rPr>
+                <w:rFonts w:cs="BRH Malayalam Extra"/>
+                <w:color w:val="000000"/>
+                <w:szCs w:val="44"/>
+              </w:rPr>
+              <w:t>30</w:t>
+            </w:r>
+            <w:r>
+              <w:rPr>
+                <w:rFonts w:ascii="BRH Malayalam Extra" w:hAnsi="BRH Malayalam Extra" w:cs="BRH Malayalam Extra"/>
+                <w:color w:val="000000"/>
+                <w:sz w:val="32"/>
+                <w:szCs w:val="44"/>
+              </w:rPr>
+              <w:t>)</w:t>
+            </w:r>
+            <w:proofErr w:type="gramStart"/>
+            <w:r>
+              <w:rPr>
+                <w:rFonts w:ascii="BRH Malayalam Extra" w:hAnsi="BRH Malayalam Extra" w:cs="BRH Malayalam Extra"/>
+                <w:color w:val="000000"/>
+                <w:sz w:val="32"/>
+                <w:szCs w:val="44"/>
+              </w:rPr>
+              <w:t>-  px</w:t>
+            </w:r>
+            <w:proofErr w:type="gramEnd"/>
+            <w:r>
+              <w:rPr>
+                <w:rFonts w:ascii="BRH Malayalam Extra" w:hAnsi="BRH Malayalam Extra" w:cs="BRH Malayalam Extra"/>
+                <w:color w:val="000000"/>
+                <w:sz w:val="26"/>
+                <w:szCs w:val="44"/>
+              </w:rPr>
+              <w:t>–</w:t>
+            </w:r>
+            <w:r>
+              <w:rPr>
+                <w:rFonts w:ascii="BRH Malayalam Extra" w:hAnsi="BRH Malayalam Extra" w:cs="BRH Malayalam Extra"/>
+                <w:color w:val="000000"/>
+                <w:sz w:val="32"/>
+                <w:szCs w:val="44"/>
+              </w:rPr>
+              <w:t>Ry</w:t>
+            </w:r>
+            <w:r>
+              <w:rPr>
+                <w:rFonts w:ascii="BRH Malayalam Extra" w:hAnsi="BRH Malayalam Extra" w:cs="BRH Malayalam Extra"/>
+                <w:color w:val="000000"/>
+                <w:sz w:val="26"/>
+                <w:szCs w:val="44"/>
+              </w:rPr>
+              <w:t>–</w:t>
+            </w:r>
+            <w:r>
+              <w:rPr>
+                <w:rFonts w:ascii="BRH Malayalam Extra" w:hAnsi="BRH Malayalam Extra" w:cs="BRH Malayalam Extra"/>
+                <w:color w:val="000000"/>
+                <w:sz w:val="32"/>
+                <w:szCs w:val="44"/>
+              </w:rPr>
+              <w:t>dz</w:t>
+            </w:r>
+            <w:r>
+              <w:rPr>
+                <w:rFonts w:ascii="BRH Malayalam Extra" w:hAnsi="BRH Malayalam Extra" w:cs="BRH Malayalam Extra"/>
+                <w:color w:val="000000"/>
+                <w:sz w:val="26"/>
+                <w:szCs w:val="44"/>
+              </w:rPr>
+              <w:t>–</w:t>
+            </w:r>
+            <w:r>
+              <w:rPr>
+                <w:rFonts w:ascii="BRH Malayalam Extra" w:hAnsi="BRH Malayalam Extra" w:cs="BRH Malayalam Extra"/>
+                <w:color w:val="000000"/>
+                <w:sz w:val="26"/>
+                <w:szCs w:val="44"/>
+              </w:rPr>
+              <w:t>–</w:t>
+            </w:r>
+            <w:r>
+              <w:rPr>
+                <w:rFonts w:ascii="BRH Malayalam Extra" w:hAnsi="BRH Malayalam Extra" w:cs="BRH Malayalam Extra"/>
+                <w:color w:val="000000"/>
+                <w:sz w:val="32"/>
+                <w:szCs w:val="44"/>
+                <w:highlight w:val="green"/>
+              </w:rPr>
+              <w:t>p</w:t>
+            </w:r>
+            <w:r>
+              <w:rPr>
+                <w:rFonts w:ascii="BRH Malayalam Extra" w:hAnsi="BRH Malayalam Extra" w:cs="BRH Malayalam Extra"/>
+                <w:color w:val="000000"/>
+                <w:sz w:val="26"/>
+                <w:szCs w:val="44"/>
+                <w:highlight w:val="green"/>
+              </w:rPr>
+              <w:t>–</w:t>
+            </w:r>
+            <w:r>
+              <w:rPr>
+                <w:rFonts w:ascii="BRH Malayalam Extra" w:hAnsi="BRH Malayalam Extra" w:cs="BRH Malayalam Extra"/>
+                <w:color w:val="000000"/>
+                <w:sz w:val="32"/>
+                <w:szCs w:val="44"/>
+                <w:highlight w:val="green"/>
+              </w:rPr>
+              <w:t>Zy</w:t>
+            </w:r>
+            <w:r>
+              <w:rPr>
+                <w:rFonts w:ascii="BRH Malayalam Extra" w:hAnsi="BRH Malayalam Extra" w:cs="BRH Malayalam Extra"/>
+                <w:color w:val="000000"/>
+                <w:sz w:val="26"/>
+                <w:szCs w:val="44"/>
+              </w:rPr>
+              <w:t>–</w:t>
+            </w:r>
+            <w:r>
+              <w:rPr>
+                <w:rFonts w:ascii="BRH Malayalam Extra" w:hAnsi="BRH Malayalam Extra" w:cs="BRH Malayalam Extra"/>
+                <w:color w:val="000000"/>
+                <w:sz w:val="26"/>
+                <w:szCs w:val="44"/>
+              </w:rPr>
+              <w:t xml:space="preserve"> </w:t>
+            </w:r>
+            <w:r>
+              <w:rPr>
+                <w:rFonts w:ascii="BRH Malayalam Extra" w:hAnsi="BRH Malayalam Extra" w:cs="BRH Malayalam Extra"/>
+                <w:color w:val="000000"/>
+                <w:sz w:val="32"/>
+                <w:szCs w:val="44"/>
+              </w:rPr>
+              <w:t>|</w:t>
+            </w:r>
           </w:p>
           <w:p>
             <w:pPr>
@@ -5907,254 +6102,6 @@
             </w:pPr>
             <w:r>
               <w:rPr>
-                <w:rFonts w:cs="BRH Malayalam Extra"/>
-                <w:color w:val="000000"/>
-                <w:szCs w:val="44"/>
-              </w:rPr>
-              <w:t>36</w:t>
-            </w:r>
-            <w:r>
-              <w:rPr>
-                <w:rFonts w:ascii="BRH Malayalam Extra" w:hAnsi="BRH Malayalam Extra" w:cs="BRH Malayalam Extra"/>
-                <w:color w:val="000000"/>
-                <w:sz w:val="32"/>
-                <w:szCs w:val="44"/>
-              </w:rPr>
-              <w:t>)</w:t>
-            </w:r>
-            <w:r>
-              <w:rPr>
-                <w:rFonts w:ascii="BRH Malayalam Extra" w:hAnsi="BRH Malayalam Extra" w:cs="BRH Malayalam Extra"/>
-                <w:color w:val="000000"/>
-                <w:sz w:val="32"/>
-                <w:szCs w:val="44"/>
-              </w:rPr>
-              <w:tab/>
-            </w:r>
-            <w:r>
-              <w:rPr>
-                <w:rFonts w:cs="BRH Malayalam Extra"/>
-                <w:color w:val="000000"/>
-                <w:szCs w:val="44"/>
-              </w:rPr>
-              <w:t>1</w:t>
-            </w:r>
-            <w:r>
-              <w:rPr>
-                <w:rFonts w:ascii="BRH Malayalam Extra" w:hAnsi="BRH Malayalam Extra" w:cs="BRH Malayalam Extra"/>
-                <w:color w:val="000000"/>
-                <w:sz w:val="32"/>
-                <w:szCs w:val="44"/>
-              </w:rPr>
-              <w:t>.</w:t>
-            </w:r>
-            <w:r>
-              <w:rPr>
-                <w:rFonts w:cs="BRH Malayalam Extra"/>
-                <w:color w:val="000000"/>
-                <w:szCs w:val="44"/>
-              </w:rPr>
-              <w:t>7</w:t>
-            </w:r>
-            <w:r>
-              <w:rPr>
-                <w:rFonts w:ascii="BRH Malayalam Extra" w:hAnsi="BRH Malayalam Extra" w:cs="BRH Malayalam Extra"/>
-                <w:color w:val="000000"/>
-                <w:sz w:val="32"/>
-                <w:szCs w:val="44"/>
-              </w:rPr>
-              <w:t>.</w:t>
-            </w:r>
-            <w:r>
-              <w:rPr>
-                <w:rFonts w:cs="BRH Malayalam Extra"/>
-                <w:color w:val="000000"/>
-                <w:szCs w:val="44"/>
-              </w:rPr>
-              <w:t>8</w:t>
-            </w:r>
-            <w:r>
-              <w:rPr>
-                <w:rFonts w:ascii="BRH Malayalam Extra" w:hAnsi="BRH Malayalam Extra" w:cs="BRH Malayalam Extra"/>
-                <w:color w:val="000000"/>
-                <w:sz w:val="32"/>
-                <w:szCs w:val="44"/>
-              </w:rPr>
-              <w:t>.</w:t>
-            </w:r>
-            <w:r>
-              <w:rPr>
-                <w:rFonts w:cs="BRH Malayalam Extra"/>
-                <w:color w:val="000000"/>
-                <w:szCs w:val="44"/>
-              </w:rPr>
-              <w:t>1</w:t>
-            </w:r>
-            <w:r>
-              <w:rPr>
-                <w:rFonts w:ascii="BRH Malayalam Extra" w:hAnsi="BRH Malayalam Extra" w:cs="BRH Malayalam Extra"/>
-                <w:color w:val="000000"/>
-                <w:sz w:val="32"/>
-                <w:szCs w:val="44"/>
-              </w:rPr>
-              <w:t>(</w:t>
-            </w:r>
-            <w:r>
-              <w:rPr>
-                <w:rFonts w:cs="BRH Malayalam Extra"/>
-                <w:color w:val="000000"/>
-                <w:szCs w:val="44"/>
-              </w:rPr>
-              <w:t>30</w:t>
-            </w:r>
-            <w:r>
-              <w:rPr>
-                <w:rFonts w:ascii="BRH Malayalam Extra" w:hAnsi="BRH Malayalam Extra" w:cs="BRH Malayalam Extra"/>
-                <w:color w:val="000000"/>
-                <w:sz w:val="32"/>
-                <w:szCs w:val="44"/>
-              </w:rPr>
-              <w:t>)</w:t>
-            </w:r>
-            <w:proofErr w:type="gramStart"/>
-            <w:r>
-              <w:rPr>
-                <w:rFonts w:ascii="BRH Malayalam Extra" w:hAnsi="BRH Malayalam Extra" w:cs="BRH Malayalam Extra"/>
-                <w:color w:val="000000"/>
-                <w:sz w:val="32"/>
-                <w:szCs w:val="44"/>
-              </w:rPr>
-              <w:t>-  px</w:t>
-            </w:r>
-            <w:proofErr w:type="gramEnd"/>
-            <w:r>
-              <w:rPr>
-                <w:rFonts w:ascii="BRH Malayalam Extra" w:hAnsi="BRH Malayalam Extra" w:cs="BRH Malayalam Extra"/>
-                <w:color w:val="000000"/>
-                <w:sz w:val="26"/>
-                <w:szCs w:val="44"/>
-              </w:rPr>
-              <w:t>–</w:t>
-            </w:r>
-            <w:r>
-              <w:rPr>
-                <w:rFonts w:ascii="BRH Malayalam Extra" w:hAnsi="BRH Malayalam Extra" w:cs="BRH Malayalam Extra"/>
-                <w:color w:val="000000"/>
-                <w:sz w:val="32"/>
-                <w:szCs w:val="44"/>
-              </w:rPr>
-              <w:t>Ry</w:t>
-            </w:r>
-            <w:r>
-              <w:rPr>
-                <w:rFonts w:ascii="BRH Malayalam Extra" w:hAnsi="BRH Malayalam Extra" w:cs="BRH Malayalam Extra"/>
-                <w:color w:val="000000"/>
-                <w:sz w:val="26"/>
-                <w:szCs w:val="44"/>
-              </w:rPr>
-              <w:t>–</w:t>
-            </w:r>
-            <w:r>
-              <w:rPr>
-                <w:rFonts w:ascii="BRH Malayalam Extra" w:hAnsi="BRH Malayalam Extra" w:cs="BRH Malayalam Extra"/>
-                <w:color w:val="000000"/>
-                <w:sz w:val="32"/>
-                <w:szCs w:val="44"/>
-              </w:rPr>
-              <w:t>dz</w:t>
-            </w:r>
-            <w:r>
-              <w:rPr>
-                <w:rFonts w:ascii="BRH Malayalam Extra" w:hAnsi="BRH Malayalam Extra" w:cs="BRH Malayalam Extra"/>
-                <w:color w:val="000000"/>
-                <w:sz w:val="26"/>
-                <w:szCs w:val="44"/>
-              </w:rPr>
-              <w:t>–</w:t>
-            </w:r>
-            <w:r>
-              <w:rPr>
-                <w:rFonts w:ascii="BRH Malayalam Extra" w:hAnsi="BRH Malayalam Extra" w:cs="BRH Malayalam Extra"/>
-                <w:color w:val="000000"/>
-                <w:sz w:val="26"/>
-                <w:szCs w:val="44"/>
-              </w:rPr>
-              <w:t>–</w:t>
-            </w:r>
-            <w:r>
-              <w:rPr>
-                <w:rFonts w:ascii="BRH Malayalam Extra" w:hAnsi="BRH Malayalam Extra" w:cs="BRH Malayalam Extra"/>
-                <w:color w:val="000000"/>
-                <w:sz w:val="32"/>
-                <w:szCs w:val="44"/>
-                <w:highlight w:val="green"/>
-              </w:rPr>
-              <w:t>p</w:t>
-            </w:r>
-            <w:r>
-              <w:rPr>
-                <w:rFonts w:ascii="BRH Malayalam Extra" w:hAnsi="BRH Malayalam Extra" w:cs="BRH Malayalam Extra"/>
-                <w:color w:val="000000"/>
-                <w:sz w:val="26"/>
-                <w:szCs w:val="44"/>
-                <w:highlight w:val="green"/>
-              </w:rPr>
-              <w:t>–</w:t>
-            </w:r>
-            <w:r>
-              <w:rPr>
-                <w:rFonts w:ascii="BRH Malayalam Extra" w:hAnsi="BRH Malayalam Extra" w:cs="BRH Malayalam Extra"/>
-                <w:color w:val="000000"/>
-                <w:sz w:val="32"/>
-                <w:szCs w:val="44"/>
-                <w:highlight w:val="green"/>
-              </w:rPr>
-              <w:t>Zy</w:t>
-            </w:r>
-            <w:r>
-              <w:rPr>
-                <w:rFonts w:ascii="BRH Malayalam Extra" w:hAnsi="BRH Malayalam Extra" w:cs="BRH Malayalam Extra"/>
-                <w:color w:val="000000"/>
-                <w:sz w:val="26"/>
-                <w:szCs w:val="44"/>
-              </w:rPr>
-              <w:t>–</w:t>
-            </w:r>
-            <w:r>
-              <w:rPr>
-                <w:rFonts w:ascii="BRH Malayalam Extra" w:hAnsi="BRH Malayalam Extra" w:cs="BRH Malayalam Extra"/>
-                <w:color w:val="000000"/>
-                <w:sz w:val="26"/>
-                <w:szCs w:val="44"/>
-              </w:rPr>
-              <w:t xml:space="preserve"> </w:t>
-            </w:r>
-            <w:r>
-              <w:rPr>
-                <w:rFonts w:ascii="BRH Malayalam Extra" w:hAnsi="BRH Malayalam Extra" w:cs="BRH Malayalam Extra"/>
-                <w:color w:val="000000"/>
-                <w:sz w:val="32"/>
-                <w:szCs w:val="44"/>
-              </w:rPr>
-              <w:t>|</w:t>
-            </w:r>
-          </w:p>
-          <w:p>
-            <w:pPr>
-              <w:widowControl w:val="0"/>
-              <w:autoSpaceDE w:val="0"/>
-              <w:autoSpaceDN w:val="0"/>
-              <w:adjustRightInd w:val="0"/>
-              <w:spacing w:line="240" w:lineRule="auto"/>
-              <w:rPr>
-                <w:rFonts w:ascii="BRH Malayalam Extra" w:hAnsi="BRH Malayalam Extra" w:cs="BRH Malayalam Extra"/>
-                <w:color w:val="000000"/>
-                <w:sz w:val="32"/>
-                <w:szCs w:val="44"/>
-              </w:rPr>
-            </w:pPr>
-            <w:r>
-              <w:rPr>
                 <w:rFonts w:ascii="BRH Malayalam Extra" w:hAnsi="BRH Malayalam Extra" w:cs="BRH Malayalam Extra"/>
                 <w:color w:val="000000"/>
                 <w:sz w:val="32"/>
@@ -6286,50 +6233,70 @@
           </w:p>
         </w:tc>
       </w:tr>
-      <w:tr>
-        <w:trPr>
-          <w:trHeight w:val="1750"/>
-        </w:trPr>
-        <w:tc>
-          <w:tcPr>
-            <w:tcW w:w="7401" w:type="dxa"/>
-          </w:tcPr>
-          <w:p>
-            <w:pPr>
-              <w:widowControl w:val="0"/>
-              <w:autoSpaceDE w:val="0"/>
-              <w:autoSpaceDN w:val="0"/>
-              <w:adjustRightInd w:val="0"/>
-              <w:spacing w:before="0" w:line="240" w:lineRule="auto"/>
-              <w:rPr>
-                <w:rFonts w:ascii="BRH Devanagari Extra" w:hAnsi="BRH Devanagari Extra" w:cs="BRH Devanagari Extra"/>
-                <w:sz w:val="32"/>
-                <w:szCs w:val="40"/>
-              </w:rPr>
-            </w:pPr>
-          </w:p>
-        </w:tc>
-        <w:tc>
-          <w:tcPr>
-            <w:tcW w:w="7371" w:type="dxa"/>
-          </w:tcPr>
-          <w:p>
-            <w:pPr>
-              <w:widowControl w:val="0"/>
-              <w:autoSpaceDE w:val="0"/>
-              <w:autoSpaceDN w:val="0"/>
-              <w:adjustRightInd w:val="0"/>
-              <w:spacing w:before="0" w:line="240" w:lineRule="auto"/>
-              <w:rPr>
-                <w:rFonts w:ascii="BRH Devanagari Extra" w:hAnsi="BRH Devanagari Extra" w:cs="BRH Devanagari Extra"/>
-                <w:sz w:val="32"/>
-                <w:szCs w:val="40"/>
-              </w:rPr>
-            </w:pPr>
-          </w:p>
-        </w:tc>
-      </w:tr>
     </w:tbl>
+    <w:p>
+      <w:pPr>
+        <w:spacing w:before="0" w:line="240" w:lineRule="auto"/>
+        <w:jc w:val="center"/>
+        <w:rPr>
+          <w:b/>
+          <w:bCs/>
+          <w:sz w:val="32"/>
+          <w:szCs w:val="32"/>
+          <w:u w:val="single"/>
+        </w:rPr>
+      </w:pPr>
+      <w:r>
+        <w:rPr>
+          <w:b/>
+          <w:bCs/>
+          <w:sz w:val="32"/>
+          <w:szCs w:val="32"/>
+          <w:u w:val="single"/>
+        </w:rPr>
+        <w:lastRenderedPageBreak/>
+        <w:t>===========</w:t>
+      </w:r>
+    </w:p>
+    <w:p>
+      <w:pPr>
+        <w:spacing w:before="0" w:line="240" w:lineRule="auto"/>
+        <w:jc w:val="center"/>
+        <w:rPr>
+          <w:b/>
+          <w:bCs/>
+          <w:sz w:val="32"/>
+          <w:szCs w:val="32"/>
+          <w:u w:val="single"/>
+        </w:rPr>
+      </w:pPr>
+    </w:p>
+    <w:p>
+      <w:pPr>
+        <w:spacing w:before="0" w:line="240" w:lineRule="auto"/>
+        <w:jc w:val="center"/>
+        <w:rPr>
+          <w:b/>
+          <w:bCs/>
+          <w:sz w:val="32"/>
+          <w:szCs w:val="32"/>
+          <w:u w:val="single"/>
+        </w:rPr>
+      </w:pPr>
+    </w:p>
+    <w:p>
+      <w:pPr>
+        <w:spacing w:before="0" w:line="240" w:lineRule="auto"/>
+        <w:jc w:val="center"/>
+        <w:rPr>
+          <w:b/>
+          <w:bCs/>
+          <w:sz w:val="32"/>
+          <w:szCs w:val="32"/>
+          <w:u w:val="single"/>
+        </w:rPr>
+      </w:pPr>
+    </w:p>
     <w:p>
       <w:pPr>
         <w:spacing w:before="0" w:line="240" w:lineRule="auto"/>
@@ -6402,6 +6369,7 @@
           <w:szCs w:val="32"/>
           <w:u w:val="single"/>
         </w:rPr>
+        <w:lastRenderedPageBreak/>
         <w:t xml:space="preserve">TS </w:t>
       </w:r>
       <w:r>
@@ -9353,7 +9321,6 @@
                 <w:szCs w:val="44"/>
                 <w:lang w:val="it-IT"/>
               </w:rPr>
-              <w:lastRenderedPageBreak/>
               <w:t>5</w:t>
             </w:r>
             <w:r>
@@ -9697,6 +9664,7 @@
                 <w:szCs w:val="44"/>
                 <w:lang w:val="it-IT"/>
               </w:rPr>
+              <w:lastRenderedPageBreak/>
               <w:t>e</w:t>
             </w:r>
             <w:r>
@@ -10117,6 +10085,7 @@
                 <w:szCs w:val="44"/>
                 <w:lang w:val="it-IT"/>
               </w:rPr>
+              <w:lastRenderedPageBreak/>
               <w:t>5</w:t>
             </w:r>
             <w:r>
@@ -10431,6 +10400,7 @@
                 <w:szCs w:val="44"/>
                 <w:lang w:val="it-IT"/>
               </w:rPr>
+              <w:lastRenderedPageBreak/>
               <w:t>e</w:t>
             </w:r>
             <w:r>
@@ -10836,6 +10806,7 @@
                 <w:szCs w:val="44"/>
                 <w:lang w:val="it-IT"/>
               </w:rPr>
+              <w:lastRenderedPageBreak/>
               <w:t>3</w:t>
             </w:r>
             <w:r>
@@ -12958,7 +12929,6 @@
                 <w:szCs w:val="44"/>
                 <w:lang w:val="it-IT"/>
               </w:rPr>
-              <w:lastRenderedPageBreak/>
               <w:t>6</w:t>
             </w:r>
             <w:r>
@@ -13535,6 +13505,7 @@
                 <w:szCs w:val="44"/>
                 <w:lang w:val="it-IT"/>
               </w:rPr>
+              <w:lastRenderedPageBreak/>
               <w:t>52</w:t>
             </w:r>
             <w:r>
@@ -15604,7 +15575,6 @@
                 <w:sz w:val="32"/>
                 <w:szCs w:val="44"/>
               </w:rPr>
-              <w:lastRenderedPageBreak/>
               <w:t>P</w:t>
             </w:r>
             <w:r>
@@ -15658,7 +15628,6 @@
                 <w:rFonts w:cs="BRH Malayalam Extra"/>
                 <w:szCs w:val="44"/>
               </w:rPr>
-              <w:lastRenderedPageBreak/>
               <w:t>41</w:t>
             </w:r>
             <w:r>
@@ -16886,7 +16855,6 @@
                 <w:sz w:val="32"/>
                 <w:szCs w:val="44"/>
               </w:rPr>
-              <w:lastRenderedPageBreak/>
               <w:t>P</w:t>
             </w:r>
             <w:r>
@@ -16984,6 +16952,7 @@
                 <w:rFonts w:cs="BRH Malayalam Extra"/>
                 <w:szCs w:val="44"/>
               </w:rPr>
+              <w:lastRenderedPageBreak/>
               <w:t>3</w:t>
             </w:r>
             <w:r>
@@ -18103,6 +18072,7 @@
                 <w:rFonts w:cs="BRH Malayalam Extra"/>
                 <w:szCs w:val="44"/>
               </w:rPr>
+              <w:lastRenderedPageBreak/>
               <w:t>3</w:t>
             </w:r>
             <w:r>
@@ -19232,6 +19202,7 @@
                 <w:rFonts w:cs="BRH Malayalam Extra"/>
                 <w:szCs w:val="44"/>
               </w:rPr>
+              <w:lastRenderedPageBreak/>
               <w:t>13</w:t>
             </w:r>
             <w:r>
@@ -19590,7 +19561,6 @@
                 <w:sz w:val="32"/>
                 <w:szCs w:val="44"/>
               </w:rPr>
-              <w:lastRenderedPageBreak/>
               <w:t>B</w:t>
             </w:r>
             <w:r>
@@ -19703,6 +19673,7 @@
                 <w:rFonts w:cs="BRH Malayalam Extra"/>
                 <w:szCs w:val="44"/>
               </w:rPr>
+              <w:lastRenderedPageBreak/>
               <w:t>15</w:t>
             </w:r>
             <w:r>
@@ -20345,7 +20316,6 @@
                 <w:sz w:val="32"/>
                 <w:szCs w:val="44"/>
               </w:rPr>
-              <w:lastRenderedPageBreak/>
               <w:t>B</w:t>
             </w:r>
             <w:r>
@@ -20458,6 +20428,7 @@
                 <w:rFonts w:cs="BRH Malayalam Extra"/>
                 <w:szCs w:val="44"/>
               </w:rPr>
+              <w:lastRenderedPageBreak/>
               <w:t>15</w:t>
             </w:r>
             <w:r>
@@ -22890,7 +22861,6 @@
                 <w:sz w:val="28"/>
                 <w:szCs w:val="28"/>
               </w:rPr>
-              <w:lastRenderedPageBreak/>
               <w:t>75)</w:t>
             </w:r>
             <w:r>
@@ -23156,6 +23126,7 @@
                 <w:rFonts w:cs="BRH Malayalam Extra"/>
                 <w:szCs w:val="44"/>
               </w:rPr>
+              <w:lastRenderedPageBreak/>
               <w:t>34</w:t>
             </w:r>
             <w:r>

</xml_diff>